<commit_message>
Document related to my ongoing Pyspark Project complete
</commit_message>
<xml_diff>
--- a/Spark Architecture Guide Documentation.docx
+++ b/Spark Architecture Guide Documentation.docx
@@ -50,7 +50,6 @@
         <w:tabs>
           <w:tab w:val="num" w:pos="360"/>
         </w:tabs>
-        <w:ind w:left="360" w:hanging="360"/>
       </w:pPr>
       <w:r>
         <w:t>Spark is an execution engine; it is not itself a database or a storage system.</w:t>
@@ -62,7 +61,6 @@
         <w:tabs>
           <w:tab w:val="num" w:pos="360"/>
         </w:tabs>
-        <w:ind w:left="360" w:hanging="360"/>
       </w:pPr>
       <w:r>
         <w:t>It can read from systems such as HDFS, S3, databases, Kafka, and local files.</w:t>
@@ -74,7 +72,6 @@
         <w:tabs>
           <w:tab w:val="num" w:pos="360"/>
         </w:tabs>
-        <w:ind w:left="360" w:hanging="360"/>
       </w:pPr>
       <w:r>
         <w:t>It provides APIs for Python, SQL, Scala, Java, and R.</w:t>
@@ -86,7 +83,6 @@
         <w:tabs>
           <w:tab w:val="num" w:pos="360"/>
         </w:tabs>
-        <w:ind w:left="360" w:hanging="360"/>
       </w:pPr>
       <w:r>
         <w:t>PySpark is the Python API for Apache Spark.</w:t>
@@ -106,7 +102,6 @@
         <w:tabs>
           <w:tab w:val="num" w:pos="360"/>
         </w:tabs>
-        <w:ind w:left="360" w:hanging="360"/>
       </w:pPr>
       <w:r>
         <w:t>Distributed processing: data and computation can be spread across machines.</w:t>
@@ -118,7 +113,6 @@
         <w:tabs>
           <w:tab w:val="num" w:pos="360"/>
         </w:tabs>
-        <w:ind w:left="360" w:hanging="360"/>
       </w:pPr>
       <w:r>
         <w:t>Parallel execution: multiple tasks can run simultaneously.</w:t>
@@ -130,7 +124,6 @@
         <w:tabs>
           <w:tab w:val="num" w:pos="360"/>
         </w:tabs>
-        <w:ind w:left="360" w:hanging="360"/>
       </w:pPr>
       <w:r>
         <w:t>Lazy evaluation: Spark builds an execution plan before running transformations.</w:t>
@@ -142,7 +135,6 @@
         <w:tabs>
           <w:tab w:val="num" w:pos="360"/>
         </w:tabs>
-        <w:ind w:left="360" w:hanging="360"/>
       </w:pPr>
       <w:r>
         <w:t>Fault tolerance: Spark can recompute lost work using lineage and other recovery mechanisms.</w:t>
@@ -154,7 +146,6 @@
         <w:tabs>
           <w:tab w:val="num" w:pos="360"/>
         </w:tabs>
-        <w:ind w:left="360" w:hanging="360"/>
       </w:pPr>
       <w:r>
         <w:t>High-level APIs: DataFrames and Spark SQL make large-scale processing easier.</w:t>
@@ -166,7 +157,6 @@
         <w:tabs>
           <w:tab w:val="num" w:pos="360"/>
         </w:tabs>
-        <w:ind w:left="360" w:hanging="360"/>
       </w:pPr>
       <w:r>
         <w:t>Multiple workloads: batch processing, SQL, streaming, machine learning, and graph processing.</w:t>
@@ -380,7 +370,6 @@
         <w:tabs>
           <w:tab w:val="num" w:pos="360"/>
         </w:tabs>
-        <w:ind w:left="360" w:hanging="360"/>
       </w:pPr>
       <w:r>
         <w:t>The Driver contains the application logic.</w:t>
@@ -392,7 +381,6 @@
         <w:tabs>
           <w:tab w:val="num" w:pos="360"/>
         </w:tabs>
-        <w:ind w:left="360" w:hanging="360"/>
       </w:pPr>
       <w:r>
         <w:t>It creates the SparkContext indirectly through SparkSession in typical modern PySpark applications.</w:t>
@@ -404,7 +392,6 @@
         <w:tabs>
           <w:tab w:val="num" w:pos="360"/>
         </w:tabs>
-        <w:ind w:left="360" w:hanging="360"/>
       </w:pPr>
       <w:r>
         <w:t>It creates jobs when actions are executed.</w:t>
@@ -416,7 +403,6 @@
         <w:tabs>
           <w:tab w:val="num" w:pos="360"/>
         </w:tabs>
-        <w:ind w:left="360" w:hanging="360"/>
       </w:pPr>
       <w:r>
         <w:t>It breaks jobs into stages and tasks and schedules those tasks.</w:t>
@@ -428,7 +414,6 @@
         <w:tabs>
           <w:tab w:val="num" w:pos="360"/>
         </w:tabs>
-        <w:ind w:left="360" w:hanging="360"/>
       </w:pPr>
       <w:r>
         <w:t>It communicates with executors.</w:t>
@@ -440,7 +425,6 @@
         <w:tabs>
           <w:tab w:val="num" w:pos="360"/>
         </w:tabs>
-        <w:ind w:left="360" w:hanging="360"/>
       </w:pPr>
       <w:r>
         <w:t>The Driver is a critical component: if the Driver fails, the application normally fails.</w:t>
@@ -515,7 +499,6 @@
         <w:tabs>
           <w:tab w:val="num" w:pos="360"/>
         </w:tabs>
-        <w:ind w:left="360" w:hanging="360"/>
       </w:pPr>
       <w:r>
         <w:t>Use SparkSession for modern PySpark applications.</w:t>
@@ -527,7 +510,6 @@
         <w:tabs>
           <w:tab w:val="num" w:pos="360"/>
         </w:tabs>
-        <w:ind w:left="360" w:hanging="360"/>
       </w:pPr>
       <w:r>
         <w:t>SparkSession can expose the underlying SparkContext as spark.sparkContext.</w:t>
@@ -606,7 +588,6 @@
         <w:tabs>
           <w:tab w:val="num" w:pos="360"/>
         </w:tabs>
-        <w:ind w:left="360" w:hanging="360"/>
       </w:pPr>
       <w:r>
         <w:t>Resilient: Spark can recover lost partitions through lineage.</w:t>
@@ -618,7 +599,6 @@
         <w:tabs>
           <w:tab w:val="num" w:pos="360"/>
         </w:tabs>
-        <w:ind w:left="360" w:hanging="360"/>
       </w:pPr>
       <w:r>
         <w:t>Distributed: data is divided into partitions that can reside on different executors.</w:t>
@@ -630,7 +610,6 @@
         <w:tabs>
           <w:tab w:val="num" w:pos="360"/>
         </w:tabs>
-        <w:ind w:left="360" w:hanging="360"/>
       </w:pPr>
       <w:r>
         <w:t>Dataset: it represents a collection of records.</w:t>
@@ -642,7 +621,6 @@
         <w:tabs>
           <w:tab w:val="num" w:pos="360"/>
         </w:tabs>
-        <w:ind w:left="360" w:hanging="360"/>
       </w:pPr>
       <w:r>
         <w:t>Immutable: transformations create new RDDs rather than changing an existing RDD.</w:t>
@@ -802,7 +780,6 @@
         <w:tabs>
           <w:tab w:val="num" w:pos="360"/>
         </w:tabs>
-        <w:ind w:left="360" w:hanging="360"/>
       </w:pPr>
       <w:r>
         <w:t>RDD: lower-level distributed collection; more control, fewer automatic SQL optimizations.</w:t>
@@ -814,7 +791,6 @@
         <w:tabs>
           <w:tab w:val="num" w:pos="360"/>
         </w:tabs>
-        <w:ind w:left="360" w:hanging="360"/>
       </w:pPr>
       <w:r>
         <w:t>DataFrame: distributed table with named columns and a schema.</w:t>
@@ -826,7 +802,6 @@
         <w:tabs>
           <w:tab w:val="num" w:pos="360"/>
         </w:tabs>
-        <w:ind w:left="360" w:hanging="360"/>
       </w:pPr>
       <w:r>
         <w:t>Dataset: strongly typed API available primarily in Scala/Java; PySpark uses DataFrames rather than a typed Dataset API.</w:t>
@@ -838,7 +813,6 @@
         <w:tabs>
           <w:tab w:val="num" w:pos="360"/>
         </w:tabs>
-        <w:ind w:left="360" w:hanging="360"/>
       </w:pPr>
       <w:r>
         <w:t>DataFrames are usually the default choice for ETL, analytics, and SQL-style processing.</w:t>
@@ -863,7 +837,6 @@
         <w:tabs>
           <w:tab w:val="num" w:pos="360"/>
         </w:tabs>
-        <w:ind w:left="360" w:hanging="360"/>
       </w:pPr>
       <w:r>
         <w:t>A worker node provides CPU, memory, and other resources.</w:t>
@@ -875,7 +848,6 @@
         <w:tabs>
           <w:tab w:val="num" w:pos="360"/>
         </w:tabs>
-        <w:ind w:left="360" w:hanging="360"/>
       </w:pPr>
       <w:r>
         <w:t>A worker can host one or more executors depending on the deployment configuration.</w:t>
@@ -887,7 +859,6 @@
         <w:tabs>
           <w:tab w:val="num" w:pos="360"/>
         </w:tabs>
-        <w:ind w:left="360" w:hanging="360"/>
       </w:pPr>
       <w:r>
         <w:t>Executors execute tasks and keep cached/shuffle-related data in memory/disk as needed.</w:t>
@@ -912,7 +883,6 @@
         <w:tabs>
           <w:tab w:val="num" w:pos="360"/>
         </w:tabs>
-        <w:ind w:left="360" w:hanging="360"/>
       </w:pPr>
       <w:r>
         <w:t>Driver = coordinator.</w:t>
@@ -924,7 +894,6 @@
         <w:tabs>
           <w:tab w:val="num" w:pos="360"/>
         </w:tabs>
-        <w:ind w:left="360" w:hanging="360"/>
       </w:pPr>
       <w:r>
         <w:t>Executor = worker process for one Spark application.</w:t>
@@ -936,7 +905,6 @@
         <w:tabs>
           <w:tab w:val="num" w:pos="360"/>
         </w:tabs>
-        <w:ind w:left="360" w:hanging="360"/>
       </w:pPr>
       <w:r>
         <w:t>Task = smallest unit of work sent to an executor.</w:t>
@@ -948,7 +916,6 @@
         <w:tabs>
           <w:tab w:val="num" w:pos="360"/>
         </w:tabs>
-        <w:ind w:left="360" w:hanging="360"/>
       </w:pPr>
       <w:r>
         <w:t>An executor can run multiple tasks concurrently when it has multiple cores.</w:t>
@@ -973,7 +940,6 @@
         <w:tabs>
           <w:tab w:val="num" w:pos="360"/>
         </w:tabs>
-        <w:ind w:left="360" w:hanging="360"/>
       </w:pPr>
       <w:r>
         <w:t>Standalone: Spark's built-in cluster manager.</w:t>
@@ -985,7 +951,6 @@
         <w:tabs>
           <w:tab w:val="num" w:pos="360"/>
         </w:tabs>
-        <w:ind w:left="360" w:hanging="360"/>
       </w:pPr>
       <w:r>
         <w:t>YARN: commonly used in Hadoop environments.</w:t>
@@ -997,7 +962,6 @@
         <w:tabs>
           <w:tab w:val="num" w:pos="360"/>
         </w:tabs>
-        <w:ind w:left="360" w:hanging="360"/>
       </w:pPr>
       <w:r>
         <w:t>Kubernetes: runs Spark applications in Kubernetes clusters.</w:t>
@@ -1009,7 +973,6 @@
         <w:tabs>
           <w:tab w:val="num" w:pos="360"/>
         </w:tabs>
-        <w:ind w:left="360" w:hanging="360"/>
       </w:pPr>
       <w:r>
         <w:t>Mesos: historically supported by Spark; its role has declined and it is not the normal choice for new deployments.</w:t>
@@ -1537,7 +1500,6 @@
         <w:tabs>
           <w:tab w:val="num" w:pos="360"/>
         </w:tabs>
-        <w:ind w:left="360" w:hanging="360"/>
       </w:pPr>
       <w:r>
         <w:t>Job: created when an action requires Spark to execute the computation.</w:t>
@@ -1549,7 +1511,6 @@
         <w:tabs>
           <w:tab w:val="num" w:pos="360"/>
         </w:tabs>
-        <w:ind w:left="360" w:hanging="360"/>
       </w:pPr>
       <w:r>
         <w:t>Stage: a group of tasks that can execute together without a shuffle boundary.</w:t>
@@ -1561,7 +1522,6 @@
         <w:tabs>
           <w:tab w:val="num" w:pos="360"/>
         </w:tabs>
-        <w:ind w:left="360" w:hanging="360"/>
       </w:pPr>
       <w:r>
         <w:lastRenderedPageBreak/>
@@ -1574,7 +1534,6 @@
         <w:tabs>
           <w:tab w:val="num" w:pos="360"/>
         </w:tabs>
-        <w:ind w:left="360" w:hanging="360"/>
       </w:pPr>
       <w:r>
         <w:t>Number of tasks in a stage is generally related to the number of partitions being processed.</w:t>
@@ -1837,7 +1796,6 @@
         <w:tabs>
           <w:tab w:val="num" w:pos="360"/>
         </w:tabs>
-        <w:ind w:left="360" w:hanging="360"/>
       </w:pPr>
       <w:r>
         <w:t>Directed: operations have a direction.</w:t>
@@ -1849,7 +1807,6 @@
         <w:tabs>
           <w:tab w:val="num" w:pos="360"/>
         </w:tabs>
-        <w:ind w:left="360" w:hanging="360"/>
       </w:pPr>
       <w:r>
         <w:t>Acyclic: execution dependencies do not form a cycle.</w:t>
@@ -1861,7 +1818,6 @@
         <w:tabs>
           <w:tab w:val="num" w:pos="360"/>
         </w:tabs>
-        <w:ind w:left="360" w:hanging="360"/>
       </w:pPr>
       <w:r>
         <w:t>The DAG represents the computation rather than being the data itself.</w:t>
@@ -1873,7 +1829,6 @@
         <w:tabs>
           <w:tab w:val="num" w:pos="360"/>
         </w:tabs>
-        <w:ind w:left="360" w:hanging="360"/>
       </w:pPr>
       <w:r>
         <w:t>Spark's scheduler uses the dependency structure to create stages and tasks.</w:t>
@@ -1899,7 +1854,6 @@
         <w:tabs>
           <w:tab w:val="num" w:pos="360"/>
         </w:tabs>
-        <w:ind w:left="360" w:hanging="360"/>
       </w:pPr>
       <w:r>
         <w:t>Narrow transformation: each output partition depends on a small/local set of input partitions. Examples include filter and many map/select operations.</w:t>
@@ -1911,7 +1865,6 @@
         <w:tabs>
           <w:tab w:val="num" w:pos="360"/>
         </w:tabs>
-        <w:ind w:left="360" w:hanging="360"/>
       </w:pPr>
       <w:r>
         <w:t>Wide transformation: output partitions may depend on many input partitions, usually requiring a shuffle. Examples include groupBy, reduceByKey, join in many cases, and orderBy.</w:t>
@@ -1969,7 +1922,6 @@
         <w:tabs>
           <w:tab w:val="num" w:pos="360"/>
         </w:tabs>
-        <w:ind w:left="360" w:hanging="360"/>
       </w:pPr>
       <w:r>
         <w:t>Shuffles can increase network traffic.</w:t>
@@ -1981,7 +1933,6 @@
         <w:tabs>
           <w:tab w:val="num" w:pos="360"/>
         </w:tabs>
-        <w:ind w:left="360" w:hanging="360"/>
       </w:pPr>
       <w:r>
         <w:t>Shuffles can increase disk I/O and memory pressure.</w:t>
@@ -1993,7 +1944,6 @@
         <w:tabs>
           <w:tab w:val="num" w:pos="360"/>
         </w:tabs>
-        <w:ind w:left="360" w:hanging="360"/>
       </w:pPr>
       <w:r>
         <w:t>Shuffles often create stage boundaries.</w:t>
@@ -2005,7 +1955,6 @@
         <w:tabs>
           <w:tab w:val="num" w:pos="360"/>
         </w:tabs>
-        <w:ind w:left="360" w:hanging="360"/>
       </w:pPr>
       <w:r>
         <w:t>Reducing unnecessary shuffles is an important optimization technique.</w:t>
@@ -2030,7 +1979,6 @@
         <w:tabs>
           <w:tab w:val="num" w:pos="360"/>
         </w:tabs>
-        <w:ind w:left="360" w:hanging="360"/>
       </w:pPr>
       <w:r>
         <w:t>One task normally processes one partition for a stage.</w:t>
@@ -2042,7 +1990,6 @@
         <w:tabs>
           <w:tab w:val="num" w:pos="360"/>
         </w:tabs>
-        <w:ind w:left="360" w:hanging="360"/>
       </w:pPr>
       <w:r>
         <w:t>More partitions can increase parallelism, but too many tiny partitions can create scheduling overhead.</w:t>
@@ -2054,7 +2001,6 @@
         <w:tabs>
           <w:tab w:val="num" w:pos="360"/>
         </w:tabs>
-        <w:ind w:left="360" w:hanging="360"/>
       </w:pPr>
       <w:r>
         <w:t>Too few partitions can underuse cluster resources and create large tasks.</w:t>
@@ -2170,46 +2116,927 @@
         <w:tabs>
           <w:tab w:val="num" w:pos="360"/>
         </w:tabs>
+      </w:pPr>
+      <w:r>
+        <w:t>cache() uses a default persistence level appropriate to the API.</w:t>
+      </w:r>
+    </w:p>
+    <w:p>
+      <w:pPr>
+        <w:pStyle w:val="ListBullet"/>
+        <w:tabs>
+          <w:tab w:val="num" w:pos="360"/>
+        </w:tabs>
+      </w:pPr>
+      <w:r>
+        <w:t>persist() lets you select a storage level.</w:t>
+      </w:r>
+    </w:p>
+    <w:p>
+      <w:pPr>
+        <w:pStyle w:val="ListBullet"/>
+        <w:tabs>
+          <w:tab w:val="num" w:pos="360"/>
+        </w:tabs>
+      </w:pPr>
+      <w:r>
+        <w:t>Caching is useful when the same expensive dataset is reused.</w:t>
+      </w:r>
+    </w:p>
+    <w:p>
+      <w:pPr>
+        <w:pStyle w:val="ListBullet"/>
+        <w:tabs>
+          <w:tab w:val="num" w:pos="360"/>
+        </w:tabs>
+      </w:pPr>
+      <w:r>
+        <w:t>Do not cache everything; unnecessary caching consumes cluster resources.</w:t>
+      </w:r>
+    </w:p>
+    <w:p>
+      <w:pPr>
+        <w:pStyle w:val="Heading1"/>
+      </w:pPr>
+      <w:r>
+        <w:t>21. Fault Tolerance and Lineage</w:t>
+      </w:r>
+    </w:p>
+    <w:p>
+      <w:r>
+        <w:t>Spark's RDD model keeps lineage information describing how data was derived. If a partition is lost, Spark can often recompute it from the required upstream operations instead of requiring the entire application to restart.</w:t>
+      </w:r>
+    </w:p>
+    <w:p>
+      <w:pPr>
+        <w:pStyle w:val="ListBullet"/>
+        <w:tabs>
+          <w:tab w:val="num" w:pos="360"/>
+        </w:tabs>
+      </w:pPr>
+      <w:r>
+        <w:t>Lineage is a dependency history for derived data.</w:t>
+      </w:r>
+    </w:p>
+    <w:p>
+      <w:pPr>
+        <w:pStyle w:val="ListBullet"/>
+        <w:tabs>
+          <w:tab w:val="num" w:pos="360"/>
+        </w:tabs>
+      </w:pPr>
+      <w:r>
+        <w:t>Partition loss can often be recovered through recomputation.</w:t>
+      </w:r>
+    </w:p>
+    <w:p>
+      <w:pPr>
+        <w:pStyle w:val="ListBullet"/>
+        <w:tabs>
+          <w:tab w:val="num" w:pos="360"/>
+        </w:tabs>
+      </w:pPr>
+      <w:r>
+        <w:t>Persisting data can reduce the amount of recomputation required.</w:t>
+      </w:r>
+    </w:p>
+    <w:p>
+      <w:pPr>
+        <w:pStyle w:val="Heading1"/>
+      </w:pPr>
+      <w:r>
+        <w:t>22. Spark SQL and Catalyst</w:t>
+      </w:r>
+    </w:p>
+    <w:p>
+      <w:r>
+        <w:t>Spark SQL provides a structured API for SQL and DataFrame operations. Spark can analyze and optimize these queries before execution.</w:t>
+      </w:r>
+    </w:p>
+    <w:p>
+      <w:pPr>
+        <w:pStyle w:val="ListBullet"/>
+        <w:tabs>
+          <w:tab w:val="num" w:pos="360"/>
+        </w:tabs>
+      </w:pPr>
+      <w:r>
+        <w:t>Catalyst is Spark SQL's query optimization framework.</w:t>
+      </w:r>
+    </w:p>
+    <w:p>
+      <w:pPr>
+        <w:pStyle w:val="ListBullet"/>
+        <w:tabs>
+          <w:tab w:val="num" w:pos="360"/>
+        </w:tabs>
+      </w:pPr>
+      <w:r>
+        <w:t>It analyzes logical plans and applies optimization rules.</w:t>
+      </w:r>
+    </w:p>
+    <w:p>
+      <w:pPr>
+        <w:pStyle w:val="ListBullet"/>
+        <w:tabs>
+          <w:tab w:val="num" w:pos="360"/>
+        </w:tabs>
+      </w:pPr>
+      <w:r>
+        <w:t>The optimized plan is converted into a physical execution plan.</w:t>
+      </w:r>
+    </w:p>
+    <w:p>
+      <w:pPr>
+        <w:pStyle w:val="ListBullet"/>
+        <w:tabs>
+          <w:tab w:val="num" w:pos="360"/>
+        </w:tabs>
+      </w:pPr>
+      <w:r>
+        <w:t>The physical plan is executed using Spark's distributed execution engine.</w:t>
+      </w:r>
+    </w:p>
+    <w:p>
+      <w:r>
+        <w:t>A simplified flow is:</w:t>
+      </w:r>
+    </w:p>
+    <w:p>
+      <w:pPr>
+        <w:ind w:left="360" w:right="360"/>
+      </w:pPr>
+      <w:r>
+        <w:rPr>
+          <w:rFonts w:ascii="Consolas" w:hAnsi="Consolas"/>
+          <w:sz w:val="18"/>
+        </w:rPr>
+        <w:t>PySpark / SQL -&gt; Logical Plan -&gt; Optimized Logical Plan -&gt; Physical Plan -&gt; Tasks on Executors</w:t>
+      </w:r>
+    </w:p>
+    <w:p>
+      <w:pPr>
+        <w:pStyle w:val="Heading1"/>
+      </w:pPr>
+      <w:r>
+        <w:lastRenderedPageBreak/>
+        <w:t>23. Tungsten and Whole-Stage Execution</w:t>
+      </w:r>
+    </w:p>
+    <w:p>
+      <w:r>
+        <w:t>Spark's execution engine includes low-level optimizations for efficient CPU and memory use. Tungsten refers to a set of Spark execution improvements, while whole-stage code generation can combine operations into efficient generated code for supported workloads.</w:t>
+      </w:r>
+    </w:p>
+    <w:p>
+      <w:pPr>
+        <w:pStyle w:val="Heading1"/>
+      </w:pPr>
+      <w:r>
+        <w:t>24. Adaptive Query Execution (AQE)</w:t>
+      </w:r>
+    </w:p>
+    <w:p>
+      <w:r>
+        <w:t>Adaptive Query Execution allows Spark SQL to adjust parts of the physical plan using runtime statistics. Examples include changing join strategies, coalescing shuffle partitions, and handling some skew situations.</w:t>
+      </w:r>
+    </w:p>
+    <w:p>
+      <w:pPr>
+        <w:ind w:left="360" w:right="360"/>
+      </w:pPr>
+      <w:r>
+        <w:rPr>
+          <w:rFonts w:ascii="Consolas" w:hAnsi="Consolas"/>
+          <w:sz w:val="18"/>
+        </w:rPr>
+        <w:t>spark.conf.get("spark.sql.adaptive.enabled")</w:t>
+      </w:r>
+    </w:p>
+    <w:p>
+      <w:pPr>
+        <w:pStyle w:val="Heading1"/>
+      </w:pPr>
+      <w:r>
+        <w:t>25. Broadcast Variables</w:t>
+      </w:r>
+    </w:p>
+    <w:p>
+      <w:r>
+        <w:t>Broadcast variables allow a read-only value to be distributed efficiently to executors rather than repeatedly shipping the same value with individual tasks.</w:t>
+      </w:r>
+    </w:p>
+    <w:p>
+      <w:pPr>
+        <w:ind w:left="360" w:right="360"/>
+      </w:pPr>
+      <w:r>
+        <w:rPr>
+          <w:rFonts w:ascii="Consolas" w:hAnsi="Consolas"/>
+          <w:sz w:val="18"/>
+        </w:rPr>
+        <w:t>lookup = {"A": "North", "B": "South"}</w:t>
+      </w:r>
+      <w:r>
+        <w:rPr>
+          <w:rFonts w:ascii="Consolas" w:hAnsi="Consolas"/>
+          <w:sz w:val="18"/>
+        </w:rPr>
+        <w:br/>
+        <w:t>broadcast_lookup = sc.broadcast(lookup)</w:t>
+      </w:r>
+      <w:r>
+        <w:rPr>
+          <w:rFonts w:ascii="Consolas" w:hAnsi="Consolas"/>
+          <w:sz w:val="18"/>
+        </w:rPr>
+        <w:br/>
+      </w:r>
+      <w:r>
+        <w:rPr>
+          <w:rFonts w:ascii="Consolas" w:hAnsi="Consolas"/>
+          <w:sz w:val="18"/>
+        </w:rPr>
+        <w:br/>
+        <w:t>rdd = sc.parallelize(["A", "B", "A"])</w:t>
+      </w:r>
+      <w:r>
+        <w:rPr>
+          <w:rFonts w:ascii="Consolas" w:hAnsi="Consolas"/>
+          <w:sz w:val="18"/>
+        </w:rPr>
+        <w:br/>
+        <w:t>result = rdd.map(lambda x: broadcast_lookup.value[x])</w:t>
+      </w:r>
+      <w:r>
+        <w:rPr>
+          <w:rFonts w:ascii="Consolas" w:hAnsi="Consolas"/>
+          <w:sz w:val="18"/>
+        </w:rPr>
+        <w:br/>
+      </w:r>
+      <w:r>
+        <w:rPr>
+          <w:rFonts w:ascii="Consolas" w:hAnsi="Consolas"/>
+          <w:sz w:val="18"/>
+        </w:rPr>
+        <w:br/>
+        <w:t>print(result.collect())</w:t>
+      </w:r>
+    </w:p>
+    <w:p>
+      <w:pPr>
+        <w:pStyle w:val="Heading1"/>
+      </w:pPr>
+      <w:r>
+        <w:t>26. Accumulators</w:t>
+      </w:r>
+    </w:p>
+    <w:p>
+      <w:r>
+        <w:t>Accumulators are variables intended mainly for aggregation of values from executors back toward the Driver, often for counters or monitoring. They should not be used as a normal way to build application state.</w:t>
+      </w:r>
+    </w:p>
+    <w:p>
+      <w:pPr>
+        <w:ind w:left="360" w:right="360"/>
+      </w:pPr>
+      <w:r>
+        <w:rPr>
+          <w:rFonts w:ascii="Consolas" w:hAnsi="Consolas"/>
+          <w:sz w:val="18"/>
+        </w:rPr>
+        <w:t>counter = sc.accumulator(0)</w:t>
+      </w:r>
+      <w:r>
+        <w:rPr>
+          <w:rFonts w:ascii="Consolas" w:hAnsi="Consolas"/>
+          <w:sz w:val="18"/>
+        </w:rPr>
+        <w:br/>
+      </w:r>
+      <w:r>
+        <w:rPr>
+          <w:rFonts w:ascii="Consolas" w:hAnsi="Consolas"/>
+          <w:sz w:val="18"/>
+        </w:rPr>
+        <w:br/>
+        <w:t>def process(x):</w:t>
+      </w:r>
+      <w:r>
+        <w:rPr>
+          <w:rFonts w:ascii="Consolas" w:hAnsi="Consolas"/>
+          <w:sz w:val="18"/>
+        </w:rPr>
+        <w:br/>
+        <w:t xml:space="preserve">    counter.add(1)</w:t>
+      </w:r>
+      <w:r>
+        <w:rPr>
+          <w:rFonts w:ascii="Consolas" w:hAnsi="Consolas"/>
+          <w:sz w:val="18"/>
+        </w:rPr>
+        <w:br/>
+        <w:t xml:space="preserve">    return x * 2</w:t>
+      </w:r>
+      <w:r>
+        <w:rPr>
+          <w:rFonts w:ascii="Consolas" w:hAnsi="Consolas"/>
+          <w:sz w:val="18"/>
+        </w:rPr>
+        <w:br/>
+      </w:r>
+      <w:r>
+        <w:rPr>
+          <w:rFonts w:ascii="Consolas" w:hAnsi="Consolas"/>
+          <w:sz w:val="18"/>
+        </w:rPr>
+        <w:br/>
+        <w:t>rdd.map(process).count()</w:t>
+      </w:r>
+      <w:r>
+        <w:rPr>
+          <w:rFonts w:ascii="Consolas" w:hAnsi="Consolas"/>
+          <w:sz w:val="18"/>
+        </w:rPr>
+        <w:br/>
+        <w:t>print(counter.value)</w:t>
+      </w:r>
+    </w:p>
+    <w:p>
+      <w:pPr>
+        <w:pStyle w:val="Heading1"/>
+      </w:pPr>
+      <w:r>
+        <w:t>27. Serialization</w:t>
+      </w:r>
+    </w:p>
+    <w:p>
+      <w:r>
+        <w:t>Spark frequently needs to move data and functions between the Driver and executors or between executors. Serialization converts objects into a transferable representation.</w:t>
+      </w:r>
+    </w:p>
+    <w:p>
+      <w:pPr>
+        <w:pStyle w:val="ListBullet"/>
+        <w:tabs>
+          <w:tab w:val="num" w:pos="360"/>
+        </w:tabs>
+      </w:pPr>
+      <w:r>
+        <w:lastRenderedPageBreak/>
+        <w:t>Python objects may be serialized when crossing the Python/JVM boundary or moving between processes.</w:t>
+      </w:r>
+    </w:p>
+    <w:p>
+      <w:pPr>
+        <w:pStyle w:val="ListBullet"/>
+        <w:tabs>
+          <w:tab w:val="num" w:pos="360"/>
+        </w:tabs>
+      </w:pPr>
+      <w:r>
+        <w:t>Serialization overhead can affect performance.</w:t>
+      </w:r>
+    </w:p>
+    <w:p>
+      <w:pPr>
+        <w:pStyle w:val="ListBullet"/>
+        <w:tabs>
+          <w:tab w:val="num" w:pos="360"/>
+        </w:tabs>
+      </w:pPr>
+      <w:r>
+        <w:t>Built-in DataFrame expressions are generally preferable to Python UDFs when equivalent native expressions exist.</w:t>
+      </w:r>
+    </w:p>
+    <w:p>
+      <w:pPr>
+        <w:pStyle w:val="Heading1"/>
+      </w:pPr>
+      <w:r>
+        <w:t>28. PySpark's Python/JVM Relationship</w:t>
+      </w:r>
+    </w:p>
+    <w:p>
+      <w:r>
+        <w:t>Spark itself is implemented primarily in Scala/Java. PySpark provides a Python interface. For many operations, Python code interacts with Spark's JVM-based execution engine. This is one reason native Spark SQL/DataFrame expressions can perform better than Python UDFs for equivalent work.</w:t>
+      </w:r>
+    </w:p>
+    <w:p>
+      <w:pPr>
+        <w:pStyle w:val="ListBullet"/>
+        <w:tabs>
+          <w:tab w:val="num" w:pos="360"/>
+        </w:tabs>
+      </w:pPr>
+      <w:r>
+        <w:t>Python application code runs on the Driver and Python worker processes may execute Python functions on executors.</w:t>
+      </w:r>
+    </w:p>
+    <w:p>
+      <w:pPr>
+        <w:pStyle w:val="ListBullet"/>
+        <w:tabs>
+          <w:tab w:val="num" w:pos="360"/>
+        </w:tabs>
+      </w:pPr>
+      <w:r>
+        <w:t>DataFrame expressions can often be optimized by Spark's SQL engine.</w:t>
+      </w:r>
+    </w:p>
+    <w:p>
+      <w:pPr>
+        <w:pStyle w:val="ListBullet"/>
+        <w:tabs>
+          <w:tab w:val="num" w:pos="360"/>
+        </w:tabs>
+      </w:pPr>
+      <w:r>
+        <w:t>Python UDFs can introduce serialization and Python execution overhead.</w:t>
+      </w:r>
+    </w:p>
+    <w:p>
+      <w:pPr>
+        <w:pStyle w:val="Heading1"/>
+      </w:pPr>
+      <w:r>
+        <w:t>29. Python UDF vs Built-in Functions</w:t>
+      </w:r>
+    </w:p>
+    <w:p>
+      <w:pPr>
+        <w:ind w:left="360" w:right="360"/>
+      </w:pPr>
+      <w:r>
+        <w:rPr>
+          <w:rFonts w:ascii="Consolas" w:hAnsi="Consolas"/>
+          <w:sz w:val="18"/>
+        </w:rPr>
+        <w:t># Prefer built-in functions when possible</w:t>
+      </w:r>
+      <w:r>
+        <w:rPr>
+          <w:rFonts w:ascii="Consolas" w:hAnsi="Consolas"/>
+          <w:sz w:val="18"/>
+        </w:rPr>
+        <w:br/>
+        <w:t>from pyspark.sql import functions as F</w:t>
+      </w:r>
+      <w:r>
+        <w:rPr>
+          <w:rFonts w:ascii="Consolas" w:hAnsi="Consolas"/>
+          <w:sz w:val="18"/>
+        </w:rPr>
+        <w:br/>
+      </w:r>
+      <w:r>
+        <w:rPr>
+          <w:rFonts w:ascii="Consolas" w:hAnsi="Consolas"/>
+          <w:sz w:val="18"/>
+        </w:rPr>
+        <w:br/>
+        <w:t>df = df.withColumn("upper_name", F.upper("name"))</w:t>
+      </w:r>
+      <w:r>
+        <w:rPr>
+          <w:rFonts w:ascii="Consolas" w:hAnsi="Consolas"/>
+          <w:sz w:val="18"/>
+        </w:rPr>
+        <w:br/>
+      </w:r>
+      <w:r>
+        <w:rPr>
+          <w:rFonts w:ascii="Consolas" w:hAnsi="Consolas"/>
+          <w:sz w:val="18"/>
+        </w:rPr>
+        <w:br/>
+        <w:t># Python UDF example</w:t>
+      </w:r>
+      <w:r>
+        <w:rPr>
+          <w:rFonts w:ascii="Consolas" w:hAnsi="Consolas"/>
+          <w:sz w:val="18"/>
+        </w:rPr>
+        <w:br/>
+        <w:t>from pyspark.sql.functions import udf</w:t>
+      </w:r>
+      <w:r>
+        <w:rPr>
+          <w:rFonts w:ascii="Consolas" w:hAnsi="Consolas"/>
+          <w:sz w:val="18"/>
+        </w:rPr>
+        <w:br/>
+        <w:t>from pyspark.sql.types import StringType</w:t>
+      </w:r>
+      <w:r>
+        <w:rPr>
+          <w:rFonts w:ascii="Consolas" w:hAnsi="Consolas"/>
+          <w:sz w:val="18"/>
+        </w:rPr>
+        <w:br/>
+      </w:r>
+      <w:r>
+        <w:rPr>
+          <w:rFonts w:ascii="Consolas" w:hAnsi="Consolas"/>
+          <w:sz w:val="18"/>
+        </w:rPr>
+        <w:br/>
+        <w:t>@udf(StringType())</w:t>
+      </w:r>
+      <w:r>
+        <w:rPr>
+          <w:rFonts w:ascii="Consolas" w:hAnsi="Consolas"/>
+          <w:sz w:val="18"/>
+        </w:rPr>
+        <w:br/>
+        <w:t>def my_func(x):</w:t>
+      </w:r>
+      <w:r>
+        <w:rPr>
+          <w:rFonts w:ascii="Consolas" w:hAnsi="Consolas"/>
+          <w:sz w:val="18"/>
+        </w:rPr>
+        <w:br/>
+        <w:t xml:space="preserve">    return x.upper() if x else None</w:t>
+      </w:r>
+    </w:p>
+    <w:p>
+      <w:r>
+        <w:t>The key lesson is not 'never use UDFs.' Use them when necessary, but prefer built-in Spark functions when they can express the same transformation because Spark can optimize native expressions more effectively.</w:t>
+      </w:r>
+    </w:p>
+    <w:p>
+      <w:pPr>
+        <w:pStyle w:val="Heading1"/>
+      </w:pPr>
+      <w:r>
+        <w:t>30. Reading and Writing Data</w:t>
+      </w:r>
+    </w:p>
+    <w:p>
+      <w:pPr>
+        <w:ind w:left="360" w:right="360"/>
+      </w:pPr>
+      <w:r>
+        <w:rPr>
+          <w:rFonts w:ascii="Consolas" w:hAnsi="Consolas"/>
+          <w:sz w:val="18"/>
+        </w:rPr>
+        <w:t>df = spark.read.csv("sales.csv", header=True, inferSchema=True)</w:t>
+      </w:r>
+      <w:r>
+        <w:rPr>
+          <w:rFonts w:ascii="Consolas" w:hAnsi="Consolas"/>
+          <w:sz w:val="18"/>
+        </w:rPr>
+        <w:br/>
+      </w:r>
+      <w:r>
+        <w:rPr>
+          <w:rFonts w:ascii="Consolas" w:hAnsi="Consolas"/>
+          <w:sz w:val="18"/>
+        </w:rPr>
+        <w:br/>
+        <w:t>df.write.mode("overwrite").parquet("output/sales")</w:t>
+      </w:r>
+      <w:r>
+        <w:rPr>
+          <w:rFonts w:ascii="Consolas" w:hAnsi="Consolas"/>
+          <w:sz w:val="18"/>
+        </w:rPr>
+        <w:br/>
+      </w:r>
+      <w:r>
+        <w:rPr>
+          <w:rFonts w:ascii="Consolas" w:hAnsi="Consolas"/>
+          <w:sz w:val="18"/>
+        </w:rPr>
+        <w:br/>
+        <w:t>df2 = spark.read.parquet("output/sales")</w:t>
+      </w:r>
+    </w:p>
+    <w:p>
+      <w:pPr>
+        <w:pStyle w:val="ListBullet"/>
+        <w:tabs>
+          <w:tab w:val="num" w:pos="360"/>
+        </w:tabs>
+      </w:pPr>
+      <w:r>
+        <w:t>Common formats: CSV, JSON, Parquet, ORC, and text.</w:t>
+      </w:r>
+    </w:p>
+    <w:p>
+      <w:pPr>
+        <w:pStyle w:val="ListBullet"/>
+        <w:tabs>
+          <w:tab w:val="num" w:pos="360"/>
+        </w:tabs>
+      </w:pPr>
+      <w:r>
+        <w:t>Parquet and ORC are columnar formats commonly used in analytics/data lake workloads.</w:t>
+      </w:r>
+    </w:p>
+    <w:p>
+      <w:pPr>
+        <w:pStyle w:val="ListBullet"/>
+        <w:tabs>
+          <w:tab w:val="num" w:pos="360"/>
+        </w:tabs>
+      </w:pPr>
+      <w:r>
+        <w:lastRenderedPageBreak/>
+        <w:t>The storage system is separate from Spark: Spark reads/writes data; HDFS/S3/etc. stores it.</w:t>
+      </w:r>
+    </w:p>
+    <w:p>
+      <w:pPr>
+        <w:pStyle w:val="Heading1"/>
+      </w:pPr>
+      <w:r>
+        <w:t>31. Cluster Deployment Modes</w:t>
+      </w:r>
+    </w:p>
+    <w:p>
+      <w:r>
+        <w:t>The Driver can run in different places depending on deployment configuration.</w:t>
+      </w:r>
+    </w:p>
+    <w:p>
+      <w:pPr>
+        <w:pStyle w:val="ListBullet"/>
+        <w:tabs>
+          <w:tab w:val="num" w:pos="360"/>
+        </w:tabs>
+      </w:pPr>
+      <w:r>
+        <w:t>Client mode: the Driver runs on the machine from which the application is submitted.</w:t>
+      </w:r>
+    </w:p>
+    <w:p>
+      <w:pPr>
+        <w:pStyle w:val="ListBullet"/>
+        <w:tabs>
+          <w:tab w:val="num" w:pos="360"/>
+        </w:tabs>
+      </w:pPr>
+      <w:r>
+        <w:t>Cluster mode: the cluster manager launches the Driver within the cluster.</w:t>
+      </w:r>
+    </w:p>
+    <w:p>
+      <w:r>
+        <w:t>The exact behavior and command syntax depend on the cluster manager and deployment environment.</w:t>
+      </w:r>
+    </w:p>
+    <w:p>
+      <w:pPr>
+        <w:pStyle w:val="Heading1"/>
+      </w:pPr>
+      <w:r>
+        <w:t>32. spark-submit</w:t>
+      </w:r>
+    </w:p>
+    <w:p>
+      <w:r>
+        <w:t>spark-submit is a standard command-line tool for submitting Spark applications.</w:t>
+      </w:r>
+    </w:p>
+    <w:p>
+      <w:pPr>
+        <w:ind w:left="360" w:right="360"/>
+      </w:pPr>
+      <w:r>
+        <w:rPr>
+          <w:rFonts w:ascii="Consolas" w:hAnsi="Consolas"/>
+          <w:sz w:val="18"/>
+        </w:rPr>
+        <w:t>spark-submit   --master &lt;master-url&gt;   --deploy-mode &lt;client-or-cluster&gt;   my_app.py</w:t>
+      </w:r>
+    </w:p>
+    <w:p>
+      <w:r>
+        <w:t>The master URL identifies the cluster manager or deployment target. In real environments, additional settings may specify executor memory, executor cores, number of executors, packages, and application configuration.</w:t>
+      </w:r>
+    </w:p>
+    <w:p>
+      <w:pPr>
+        <w:pStyle w:val="Heading1"/>
+      </w:pPr>
+      <w:r>
+        <w:t>33. A Complete Mental Execution Example</w:t>
+      </w:r>
+    </w:p>
+    <w:p>
+      <w:r>
+        <w:t>Suppose you run:</w:t>
+      </w:r>
+    </w:p>
+    <w:p>
+      <w:pPr>
+        <w:ind w:left="360" w:right="360"/>
+      </w:pPr>
+      <w:r>
+        <w:rPr>
+          <w:rFonts w:ascii="Consolas" w:hAnsi="Consolas"/>
+          <w:sz w:val="18"/>
+        </w:rPr>
+        <w:t>df = spark.read.parquet("sales.parquet")</w:t>
+      </w:r>
+      <w:r>
+        <w:rPr>
+          <w:rFonts w:ascii="Consolas" w:hAnsi="Consolas"/>
+          <w:sz w:val="18"/>
+        </w:rPr>
+        <w:br/>
+      </w:r>
+      <w:r>
+        <w:rPr>
+          <w:rFonts w:ascii="Consolas" w:hAnsi="Consolas"/>
+          <w:sz w:val="18"/>
+        </w:rPr>
+        <w:br/>
+        <w:t>result = (</w:t>
+      </w:r>
+      <w:r>
+        <w:rPr>
+          <w:rFonts w:ascii="Consolas" w:hAnsi="Consolas"/>
+          <w:sz w:val="18"/>
+        </w:rPr>
+        <w:br/>
+        <w:t xml:space="preserve">    df.filter("amount &gt; 100")</w:t>
+      </w:r>
+      <w:r>
+        <w:rPr>
+          <w:rFonts w:ascii="Consolas" w:hAnsi="Consolas"/>
+          <w:sz w:val="18"/>
+        </w:rPr>
+        <w:br/>
+        <w:t xml:space="preserve">      .groupBy("customer_id")</w:t>
+      </w:r>
+      <w:r>
+        <w:rPr>
+          <w:rFonts w:ascii="Consolas" w:hAnsi="Consolas"/>
+          <w:sz w:val="18"/>
+        </w:rPr>
+        <w:br/>
+        <w:t xml:space="preserve">      .sum("amount")</w:t>
+      </w:r>
+      <w:r>
+        <w:rPr>
+          <w:rFonts w:ascii="Consolas" w:hAnsi="Consolas"/>
+          <w:sz w:val="18"/>
+        </w:rPr>
+        <w:br/>
+        <w:t>)</w:t>
+      </w:r>
+      <w:r>
+        <w:rPr>
+          <w:rFonts w:ascii="Consolas" w:hAnsi="Consolas"/>
+          <w:sz w:val="18"/>
+        </w:rPr>
+        <w:br/>
+      </w:r>
+      <w:r>
+        <w:rPr>
+          <w:rFonts w:ascii="Consolas" w:hAnsi="Consolas"/>
+          <w:sz w:val="18"/>
+        </w:rPr>
+        <w:br/>
+        <w:t>result.show()</w:t>
+      </w:r>
+    </w:p>
+    <w:p>
+      <w:pPr>
+        <w:pStyle w:val="ListNumber"/>
+        <w:tabs>
+          <w:tab w:val="num" w:pos="360"/>
+        </w:tabs>
         <w:ind w:left="360" w:hanging="360"/>
       </w:pPr>
       <w:r>
-        <w:t>cache() uses a default persistence level appropriate to the API.</w:t>
-      </w:r>
-    </w:p>
-    <w:p>
-      <w:pPr>
-        <w:pStyle w:val="ListBullet"/>
+        <w:t>SparkSession/SparkContext is already connected to the execution environment.</w:t>
+      </w:r>
+    </w:p>
+    <w:p>
+      <w:pPr>
+        <w:pStyle w:val="ListNumber"/>
         <w:tabs>
           <w:tab w:val="num" w:pos="360"/>
         </w:tabs>
         <w:ind w:left="360" w:hanging="360"/>
       </w:pPr>
       <w:r>
-        <w:t>persist() lets you select a storage level.</w:t>
-      </w:r>
-    </w:p>
-    <w:p>
-      <w:pPr>
-        <w:pStyle w:val="ListBullet"/>
+        <w:t>Spark records the read and transformations instead of immediately executing the entire pipeline.</w:t>
+      </w:r>
+    </w:p>
+    <w:p>
+      <w:pPr>
+        <w:pStyle w:val="ListNumber"/>
         <w:tabs>
           <w:tab w:val="num" w:pos="360"/>
         </w:tabs>
         <w:ind w:left="360" w:hanging="360"/>
       </w:pPr>
       <w:r>
-        <w:t>Caching is useful when the same expensive dataset is reused.</w:t>
-      </w:r>
-    </w:p>
-    <w:p>
-      <w:pPr>
-        <w:pStyle w:val="ListBullet"/>
+        <w:t>show() is an action and causes Spark to execute the required computation.</w:t>
+      </w:r>
+    </w:p>
+    <w:p>
+      <w:pPr>
+        <w:pStyle w:val="ListNumber"/>
         <w:tabs>
           <w:tab w:val="num" w:pos="360"/>
         </w:tabs>
         <w:ind w:left="360" w:hanging="360"/>
       </w:pPr>
       <w:r>
-        <w:t>Do not cache everything; unnecessary caching consumes cluster resources.</w:t>
+        <w:t>The Driver creates a job for the action.</w:t>
+      </w:r>
+    </w:p>
+    <w:p>
+      <w:pPr>
+        <w:pStyle w:val="ListNumber"/>
+        <w:tabs>
+          <w:tab w:val="num" w:pos="360"/>
+        </w:tabs>
+        <w:ind w:left="360" w:hanging="360"/>
+      </w:pPr>
+      <w:r>
+        <w:t>Spark analyzes the operations and identifies dependencies.</w:t>
+      </w:r>
+    </w:p>
+    <w:p>
+      <w:pPr>
+        <w:pStyle w:val="ListNumber"/>
+        <w:tabs>
+          <w:tab w:val="num" w:pos="360"/>
+        </w:tabs>
+        <w:ind w:left="360" w:hanging="360"/>
+      </w:pPr>
+      <w:r>
+        <w:t>A shuffle may be required for groupBy.</w:t>
+      </w:r>
+    </w:p>
+    <w:p>
+      <w:pPr>
+        <w:pStyle w:val="ListNumber"/>
+        <w:tabs>
+          <w:tab w:val="num" w:pos="360"/>
+        </w:tabs>
+        <w:ind w:left="360" w:hanging="360"/>
+      </w:pPr>
+      <w:r>
+        <w:t>The job is divided into stages around shuffle boundaries.</w:t>
+      </w:r>
+    </w:p>
+    <w:p>
+      <w:pPr>
+        <w:pStyle w:val="ListNumber"/>
+        <w:tabs>
+          <w:tab w:val="num" w:pos="360"/>
+        </w:tabs>
+        <w:ind w:left="360" w:hanging="360"/>
+      </w:pPr>
+      <w:r>
+        <w:t>Stages are divided into tasks, commonly one task per input partition for a stage.</w:t>
+      </w:r>
+    </w:p>
+    <w:p>
+      <w:pPr>
+        <w:pStyle w:val="ListNumber"/>
+        <w:tabs>
+          <w:tab w:val="num" w:pos="360"/>
+        </w:tabs>
+        <w:ind w:left="360" w:hanging="360"/>
+      </w:pPr>
+      <w:r>
+        <w:t>The cluster manager provides resources and executors run the tasks.</w:t>
+      </w:r>
+    </w:p>
+    <w:p>
+      <w:pPr>
+        <w:pStyle w:val="ListNumber"/>
+        <w:tabs>
+          <w:tab w:val="num" w:pos="360"/>
+        </w:tabs>
+        <w:ind w:left="360" w:hanging="360"/>
+      </w:pPr>
+      <w:r>
+        <w:t>Executors read data, process partitions, and exchange shuffle data as required.</w:t>
+      </w:r>
+    </w:p>
+    <w:p>
+      <w:pPr>
+        <w:pStyle w:val="ListNumber"/>
+        <w:tabs>
+          <w:tab w:val="num" w:pos="360"/>
+        </w:tabs>
+        <w:ind w:left="360" w:hanging="360"/>
+      </w:pPr>
+      <w:r>
+        <w:t>Results are returned or displayed through the Driver.</w:t>
       </w:r>
     </w:p>
     <w:p>
@@ -2217,48 +3044,1567 @@
         <w:pStyle w:val="Heading1"/>
       </w:pPr>
       <w:r>
-        <w:t>21. Fault Tolerance and Lineage</w:t>
-      </w:r>
-    </w:p>
-    <w:p>
-      <w:r>
-        <w:t>Spark's RDD model keeps lineage information describing how data was derived. If a partition is lost, Spark can often recompute it from the required upstream operations instead of requiring the entire application to restart.</w:t>
-      </w:r>
-    </w:p>
-    <w:p>
-      <w:pPr>
-        <w:pStyle w:val="ListBullet"/>
+        <w:lastRenderedPageBreak/>
+        <w:t>34. Most Important PySpark Commands for Beginners</w:t>
+      </w:r>
+    </w:p>
+    <w:p>
+      <w:pPr>
+        <w:ind w:left="360" w:right="360"/>
+      </w:pPr>
+      <w:r>
+        <w:rPr>
+          <w:rFonts w:ascii="Consolas" w:hAnsi="Consolas"/>
+          <w:sz w:val="18"/>
+        </w:rPr>
+        <w:t># Create session</w:t>
+      </w:r>
+      <w:r>
+        <w:rPr>
+          <w:rFonts w:ascii="Consolas" w:hAnsi="Consolas"/>
+          <w:sz w:val="18"/>
+        </w:rPr>
+        <w:br/>
+        <w:t>spark = SparkSession.builder.appName("App").getOrCreate()</w:t>
+      </w:r>
+      <w:r>
+        <w:rPr>
+          <w:rFonts w:ascii="Consolas" w:hAnsi="Consolas"/>
+          <w:sz w:val="18"/>
+        </w:rPr>
+        <w:br/>
+      </w:r>
+      <w:r>
+        <w:rPr>
+          <w:rFonts w:ascii="Consolas" w:hAnsi="Consolas"/>
+          <w:sz w:val="18"/>
+        </w:rPr>
+        <w:br/>
+        <w:t># Inspect SparkContext</w:t>
+      </w:r>
+      <w:r>
+        <w:rPr>
+          <w:rFonts w:ascii="Consolas" w:hAnsi="Consolas"/>
+          <w:sz w:val="18"/>
+        </w:rPr>
+        <w:br/>
+        <w:t>sc = spark.sparkContext</w:t>
+      </w:r>
+      <w:r>
+        <w:rPr>
+          <w:rFonts w:ascii="Consolas" w:hAnsi="Consolas"/>
+          <w:sz w:val="18"/>
+        </w:rPr>
+        <w:br/>
+      </w:r>
+      <w:r>
+        <w:rPr>
+          <w:rFonts w:ascii="Consolas" w:hAnsi="Consolas"/>
+          <w:sz w:val="18"/>
+        </w:rPr>
+        <w:br/>
+        <w:t># Read</w:t>
+      </w:r>
+      <w:r>
+        <w:rPr>
+          <w:rFonts w:ascii="Consolas" w:hAnsi="Consolas"/>
+          <w:sz w:val="18"/>
+        </w:rPr>
+        <w:br/>
+        <w:t>df = spark.read.csv("file.csv", header=True, inferSchema=True)</w:t>
+      </w:r>
+      <w:r>
+        <w:rPr>
+          <w:rFonts w:ascii="Consolas" w:hAnsi="Consolas"/>
+          <w:sz w:val="18"/>
+        </w:rPr>
+        <w:br/>
+      </w:r>
+      <w:r>
+        <w:rPr>
+          <w:rFonts w:ascii="Consolas" w:hAnsi="Consolas"/>
+          <w:sz w:val="18"/>
+        </w:rPr>
+        <w:br/>
+        <w:t># Inspect</w:t>
+      </w:r>
+      <w:r>
+        <w:rPr>
+          <w:rFonts w:ascii="Consolas" w:hAnsi="Consolas"/>
+          <w:sz w:val="18"/>
+        </w:rPr>
+        <w:br/>
+        <w:t>df.show(truncate=False)</w:t>
+      </w:r>
+      <w:r>
+        <w:rPr>
+          <w:rFonts w:ascii="Consolas" w:hAnsi="Consolas"/>
+          <w:sz w:val="18"/>
+        </w:rPr>
+        <w:br/>
+        <w:t>df.printSchema()</w:t>
+      </w:r>
+      <w:r>
+        <w:rPr>
+          <w:rFonts w:ascii="Consolas" w:hAnsi="Consolas"/>
+          <w:sz w:val="18"/>
+        </w:rPr>
+        <w:br/>
+        <w:t>df.columns</w:t>
+      </w:r>
+      <w:r>
+        <w:rPr>
+          <w:rFonts w:ascii="Consolas" w:hAnsi="Consolas"/>
+          <w:sz w:val="18"/>
+        </w:rPr>
+        <w:br/>
+        <w:t>df.count()</w:t>
+      </w:r>
+      <w:r>
+        <w:rPr>
+          <w:rFonts w:ascii="Consolas" w:hAnsi="Consolas"/>
+          <w:sz w:val="18"/>
+        </w:rPr>
+        <w:br/>
+      </w:r>
+      <w:r>
+        <w:rPr>
+          <w:rFonts w:ascii="Consolas" w:hAnsi="Consolas"/>
+          <w:sz w:val="18"/>
+        </w:rPr>
+        <w:br/>
+        <w:t># Transform</w:t>
+      </w:r>
+      <w:r>
+        <w:rPr>
+          <w:rFonts w:ascii="Consolas" w:hAnsi="Consolas"/>
+          <w:sz w:val="18"/>
+        </w:rPr>
+        <w:br/>
+        <w:t>df.select("name", "salary")</w:t>
+      </w:r>
+      <w:r>
+        <w:rPr>
+          <w:rFonts w:ascii="Consolas" w:hAnsi="Consolas"/>
+          <w:sz w:val="18"/>
+        </w:rPr>
+        <w:br/>
+        <w:t>df.filter(df.salary &gt; 50000)</w:t>
+      </w:r>
+      <w:r>
+        <w:rPr>
+          <w:rFonts w:ascii="Consolas" w:hAnsi="Consolas"/>
+          <w:sz w:val="18"/>
+        </w:rPr>
+        <w:br/>
+        <w:t>df.withColumn("bonus", df.salary * 0.10)</w:t>
+      </w:r>
+      <w:r>
+        <w:rPr>
+          <w:rFonts w:ascii="Consolas" w:hAnsi="Consolas"/>
+          <w:sz w:val="18"/>
+        </w:rPr>
+        <w:br/>
+        <w:t>df.groupBy("department").count()</w:t>
+      </w:r>
+      <w:r>
+        <w:rPr>
+          <w:rFonts w:ascii="Consolas" w:hAnsi="Consolas"/>
+          <w:sz w:val="18"/>
+        </w:rPr>
+        <w:br/>
+      </w:r>
+      <w:r>
+        <w:rPr>
+          <w:rFonts w:ascii="Consolas" w:hAnsi="Consolas"/>
+          <w:sz w:val="18"/>
+        </w:rPr>
+        <w:br/>
+        <w:t># Write</w:t>
+      </w:r>
+      <w:r>
+        <w:rPr>
+          <w:rFonts w:ascii="Consolas" w:hAnsi="Consolas"/>
+          <w:sz w:val="18"/>
+        </w:rPr>
+        <w:br/>
+        <w:t>df.write.mode("overwrite").parquet("output/path")</w:t>
+      </w:r>
+      <w:r>
+        <w:rPr>
+          <w:rFonts w:ascii="Consolas" w:hAnsi="Consolas"/>
+          <w:sz w:val="18"/>
+        </w:rPr>
+        <w:br/>
+      </w:r>
+      <w:r>
+        <w:rPr>
+          <w:rFonts w:ascii="Consolas" w:hAnsi="Consolas"/>
+          <w:sz w:val="18"/>
+        </w:rPr>
+        <w:br/>
+        <w:t># Partitions</w:t>
+      </w:r>
+      <w:r>
+        <w:rPr>
+          <w:rFonts w:ascii="Consolas" w:hAnsi="Consolas"/>
+          <w:sz w:val="18"/>
+        </w:rPr>
+        <w:br/>
+        <w:t>df.rdd.getNumPartitions()</w:t>
+      </w:r>
+      <w:r>
+        <w:rPr>
+          <w:rFonts w:ascii="Consolas" w:hAnsi="Consolas"/>
+          <w:sz w:val="18"/>
+        </w:rPr>
+        <w:br/>
+        <w:t>df.repartition(10)</w:t>
+      </w:r>
+      <w:r>
+        <w:rPr>
+          <w:rFonts w:ascii="Consolas" w:hAnsi="Consolas"/>
+          <w:sz w:val="18"/>
+        </w:rPr>
+        <w:br/>
+        <w:t>df.coalesce(5)</w:t>
+      </w:r>
+      <w:r>
+        <w:rPr>
+          <w:rFonts w:ascii="Consolas" w:hAnsi="Consolas"/>
+          <w:sz w:val="18"/>
+        </w:rPr>
+        <w:br/>
+      </w:r>
+      <w:r>
+        <w:rPr>
+          <w:rFonts w:ascii="Consolas" w:hAnsi="Consolas"/>
+          <w:sz w:val="18"/>
+        </w:rPr>
+        <w:br/>
+        <w:t># Cache</w:t>
+      </w:r>
+      <w:r>
+        <w:rPr>
+          <w:rFonts w:ascii="Consolas" w:hAnsi="Consolas"/>
+          <w:sz w:val="18"/>
+        </w:rPr>
+        <w:br/>
+        <w:t>df.cache()</w:t>
+      </w:r>
+      <w:r>
+        <w:rPr>
+          <w:rFonts w:ascii="Consolas" w:hAnsi="Consolas"/>
+          <w:sz w:val="18"/>
+        </w:rPr>
+        <w:br/>
+        <w:t>df.unpersist()</w:t>
+      </w:r>
+      <w:r>
+        <w:rPr>
+          <w:rFonts w:ascii="Consolas" w:hAnsi="Consolas"/>
+          <w:sz w:val="18"/>
+        </w:rPr>
+        <w:br/>
+      </w:r>
+      <w:r>
+        <w:rPr>
+          <w:rFonts w:ascii="Consolas" w:hAnsi="Consolas"/>
+          <w:sz w:val="18"/>
+        </w:rPr>
+        <w:br/>
+        <w:t># Stop</w:t>
+      </w:r>
+      <w:r>
+        <w:rPr>
+          <w:rFonts w:ascii="Consolas" w:hAnsi="Consolas"/>
+          <w:sz w:val="18"/>
+        </w:rPr>
+        <w:br/>
+        <w:t>spark.stop()</w:t>
+      </w:r>
+    </w:p>
+    <w:p>
+      <w:pPr>
+        <w:pStyle w:val="Heading1"/>
+      </w:pPr>
+      <w:r>
+        <w:t>35. Spark UI: What to Look At</w:t>
+      </w:r>
+    </w:p>
+    <w:p>
+      <w:r>
+        <w:t>The Spark Web UI is one of the best tools for understanding what your application is actually doing.</w:t>
+      </w:r>
+    </w:p>
+    <w:p>
+      <w:pPr>
+        <w:pStyle w:val="ListBullet"/>
+        <w:tabs>
+          <w:tab w:val="num" w:pos="360"/>
+        </w:tabs>
+      </w:pPr>
+      <w:r>
+        <w:t>Jobs: see jobs created by actions.</w:t>
+      </w:r>
+    </w:p>
+    <w:p>
+      <w:pPr>
+        <w:pStyle w:val="ListBullet"/>
+        <w:tabs>
+          <w:tab w:val="num" w:pos="360"/>
+        </w:tabs>
+      </w:pPr>
+      <w:r>
+        <w:t>Stages: inspect stage execution and shuffle behavior.</w:t>
+      </w:r>
+    </w:p>
+    <w:p>
+      <w:pPr>
+        <w:pStyle w:val="ListBullet"/>
+        <w:tabs>
+          <w:tab w:val="num" w:pos="360"/>
+        </w:tabs>
+      </w:pPr>
+      <w:r>
+        <w:t>Tasks: inspect task-level execution and failures.</w:t>
+      </w:r>
+    </w:p>
+    <w:p>
+      <w:pPr>
+        <w:pStyle w:val="ListBullet"/>
+        <w:tabs>
+          <w:tab w:val="num" w:pos="360"/>
+        </w:tabs>
+      </w:pPr>
+      <w:r>
+        <w:t>SQL: inspect SQL/DataFrame query plans and execution details.</w:t>
+      </w:r>
+    </w:p>
+    <w:p>
+      <w:pPr>
+        <w:pStyle w:val="ListBullet"/>
+        <w:tabs>
+          <w:tab w:val="num" w:pos="360"/>
+        </w:tabs>
+      </w:pPr>
+      <w:r>
+        <w:t>Executors: inspect executor resources, storage, and task information.</w:t>
+      </w:r>
+    </w:p>
+    <w:p>
+      <w:pPr>
+        <w:pStyle w:val="ListBullet"/>
+        <w:tabs>
+          <w:tab w:val="num" w:pos="360"/>
+        </w:tabs>
+      </w:pPr>
+      <w:r>
+        <w:t>Storage: inspect cached/persisted datasets.</w:t>
+      </w:r>
+    </w:p>
+    <w:p>
+      <w:pPr>
+        <w:pStyle w:val="Heading1"/>
+      </w:pPr>
+      <w:r>
+        <w:lastRenderedPageBreak/>
+        <w:t>36. Common Performance Concepts</w:t>
+      </w:r>
+    </w:p>
+    <w:p>
+      <w:pPr>
+        <w:pStyle w:val="ListBullet"/>
+        <w:tabs>
+          <w:tab w:val="num" w:pos="360"/>
+        </w:tabs>
+      </w:pPr>
+      <w:r>
+        <w:t>Avoid unnecessary shuffles.</w:t>
+      </w:r>
+    </w:p>
+    <w:p>
+      <w:pPr>
+        <w:pStyle w:val="ListBullet"/>
+        <w:tabs>
+          <w:tab w:val="num" w:pos="360"/>
+        </w:tabs>
+      </w:pPr>
+      <w:r>
+        <w:t>Use DataFrame/Spark SQL APIs where practical.</w:t>
+      </w:r>
+    </w:p>
+    <w:p>
+      <w:pPr>
+        <w:pStyle w:val="ListBullet"/>
+        <w:tabs>
+          <w:tab w:val="num" w:pos="360"/>
+        </w:tabs>
+      </w:pPr>
+      <w:r>
+        <w:t>Filter early when it reduces the amount of data processed.</w:t>
+      </w:r>
+    </w:p>
+    <w:p>
+      <w:pPr>
+        <w:pStyle w:val="ListBullet"/>
+        <w:tabs>
+          <w:tab w:val="num" w:pos="360"/>
+        </w:tabs>
+      </w:pPr>
+      <w:r>
+        <w:t>Select only the columns you need.</w:t>
+      </w:r>
+    </w:p>
+    <w:p>
+      <w:pPr>
+        <w:pStyle w:val="ListBullet"/>
+        <w:tabs>
+          <w:tab w:val="num" w:pos="360"/>
+        </w:tabs>
+      </w:pPr>
+      <w:r>
+        <w:t>Choose reasonable partition counts.</w:t>
+      </w:r>
+    </w:p>
+    <w:p>
+      <w:pPr>
+        <w:pStyle w:val="ListBullet"/>
+        <w:tabs>
+          <w:tab w:val="num" w:pos="360"/>
+        </w:tabs>
+      </w:pPr>
+      <w:r>
+        <w:t>Use Parquet/ORC for analytics workloads when appropriate.</w:t>
+      </w:r>
+    </w:p>
+    <w:p>
+      <w:pPr>
+        <w:pStyle w:val="ListBullet"/>
+        <w:tabs>
+          <w:tab w:val="num" w:pos="360"/>
+        </w:tabs>
+      </w:pPr>
+      <w:r>
+        <w:t>Cache only reused expensive datasets.</w:t>
+      </w:r>
+    </w:p>
+    <w:p>
+      <w:pPr>
+        <w:pStyle w:val="ListBullet"/>
+        <w:tabs>
+          <w:tab w:val="num" w:pos="360"/>
+        </w:tabs>
+      </w:pPr>
+      <w:r>
+        <w:t>Watch for data skew in joins and aggregations.</w:t>
+      </w:r>
+    </w:p>
+    <w:p>
+      <w:pPr>
+        <w:pStyle w:val="ListBullet"/>
+        <w:tabs>
+          <w:tab w:val="num" w:pos="360"/>
+        </w:tabs>
+      </w:pPr>
+      <w:r>
+        <w:t>Use broadcast joins when one side is genuinely small enough to broadcast.</w:t>
+      </w:r>
+    </w:p>
+    <w:p>
+      <w:pPr>
+        <w:pStyle w:val="ListBullet"/>
+        <w:tabs>
+          <w:tab w:val="num" w:pos="360"/>
+        </w:tabs>
+      </w:pPr>
+      <w:r>
+        <w:t>Avoid collect() on large datasets because it brings data to the Driver.</w:t>
+      </w:r>
+    </w:p>
+    <w:p>
+      <w:pPr>
+        <w:pStyle w:val="Heading1"/>
+      </w:pPr>
+      <w:r>
+        <w:t>37. Data Skew</w:t>
+      </w:r>
+    </w:p>
+    <w:p>
+      <w:r>
+        <w:t>Data skew occurs when some partitions contain substantially more data than others. One or a few tasks can then take much longer than the rest, creating a straggler problem.</w:t>
+      </w:r>
+    </w:p>
+    <w:p>
+      <w:pPr>
+        <w:pStyle w:val="ListBullet"/>
+        <w:tabs>
+          <w:tab w:val="num" w:pos="360"/>
+        </w:tabs>
+      </w:pPr>
+      <w:r>
+        <w:t>Common causes: highly uneven key distributions in joins or aggregations.</w:t>
+      </w:r>
+    </w:p>
+    <w:p>
+      <w:pPr>
+        <w:pStyle w:val="ListBullet"/>
+        <w:tabs>
+          <w:tab w:val="num" w:pos="360"/>
+        </w:tabs>
+      </w:pPr>
+      <w:r>
+        <w:t>Symptoms: most tasks finish quickly while a small number take much longer.</w:t>
+      </w:r>
+    </w:p>
+    <w:p>
+      <w:pPr>
+        <w:pStyle w:val="ListBullet"/>
+        <w:tabs>
+          <w:tab w:val="num" w:pos="360"/>
+        </w:tabs>
+      </w:pPr>
+      <w:r>
+        <w:t>Potential techniques: better partitioning, broadcast joins when appropriate, salting in suitable cases, and AQE/skew handling.</w:t>
+      </w:r>
+    </w:p>
+    <w:p>
+      <w:pPr>
+        <w:pStyle w:val="Heading1"/>
+      </w:pPr>
+      <w:r>
+        <w:t>38. Driver-Side Mistakes to Avoid</w:t>
+      </w:r>
+    </w:p>
+    <w:p>
+      <w:pPr>
+        <w:pStyle w:val="ListBullet"/>
+        <w:tabs>
+          <w:tab w:val="num" w:pos="360"/>
+        </w:tabs>
+      </w:pPr>
+      <w:r>
+        <w:t>Do not use collect() on a huge DataFrame unless you know the result is small.</w:t>
+      </w:r>
+    </w:p>
+    <w:p>
+      <w:pPr>
+        <w:pStyle w:val="ListBullet"/>
+        <w:tabs>
+          <w:tab w:val="num" w:pos="360"/>
+        </w:tabs>
+      </w:pPr>
+      <w:r>
+        <w:t>Do not put large datasets into normal Driver-side Python variables unnecessarily.</w:t>
+      </w:r>
+    </w:p>
+    <w:p>
+      <w:pPr>
+        <w:pStyle w:val="ListBullet"/>
+        <w:tabs>
+          <w:tab w:val="num" w:pos="360"/>
+        </w:tabs>
+      </w:pPr>
+      <w:r>
+        <w:t>Do not assume a transformation has executed just because you wrote the line.</w:t>
+      </w:r>
+    </w:p>
+    <w:p>
+      <w:pPr>
+        <w:pStyle w:val="ListBullet"/>
+        <w:tabs>
+          <w:tab w:val="num" w:pos="360"/>
+        </w:tabs>
+      </w:pPr>
+      <w:r>
+        <w:t>Do not confuse an executor with a worker node: the executor is a process running on the worker.</w:t>
+      </w:r>
+    </w:p>
+    <w:p>
+      <w:pPr>
+        <w:pStyle w:val="ListBullet"/>
+        <w:tabs>
+          <w:tab w:val="num" w:pos="360"/>
+        </w:tabs>
+      </w:pPr>
+      <w:r>
+        <w:t>Do not confuse Spark with HDFS/S3: Spark computes; storage systems store.</w:t>
+      </w:r>
+    </w:p>
+    <w:p>
+      <w:pPr>
+        <w:pStyle w:val="Heading1"/>
+      </w:pPr>
+      <w:r>
+        <w:t>39. Core Terminology Cheat Sheet</w:t>
+      </w:r>
+    </w:p>
+    <w:tbl>
+      <w:tblPr>
+        <w:tblStyle w:val="TableGrid"/>
+        <w:tblW w:w="0" w:type="auto"/>
+        <w:tblLook w:val="04A0" w:firstRow="1" w:lastRow="0" w:firstColumn="1" w:lastColumn="0" w:noHBand="0" w:noVBand="1"/>
+      </w:tblPr>
+      <w:tblGrid>
+        <w:gridCol w:w="4661"/>
+        <w:gridCol w:w="4689"/>
+      </w:tblGrid>
+      <w:tr>
+        <w:tc>
+          <w:tcPr>
+            <w:tcW w:w="5040" w:type="dxa"/>
+          </w:tcPr>
+          <w:p>
+            <w:r>
+              <w:t>Term</w:t>
+            </w:r>
+          </w:p>
+        </w:tc>
+        <w:tc>
+          <w:tcPr>
+            <w:tcW w:w="5040" w:type="dxa"/>
+          </w:tcPr>
+          <w:p>
+            <w:r>
+              <w:t>Meaning</w:t>
+            </w:r>
+          </w:p>
+        </w:tc>
+      </w:tr>
+      <w:tr>
+        <w:tc>
+          <w:tcPr>
+            <w:tcW w:w="5040" w:type="dxa"/>
+          </w:tcPr>
+          <w:p>
+            <w:r>
+              <w:t>Spark</w:t>
+            </w:r>
+          </w:p>
+        </w:tc>
+        <w:tc>
+          <w:tcPr>
+            <w:tcW w:w="5040" w:type="dxa"/>
+          </w:tcPr>
+          <w:p>
+            <w:r>
+              <w:t>Distributed data-processing engine.</w:t>
+            </w:r>
+          </w:p>
+        </w:tc>
+      </w:tr>
+      <w:tr>
+        <w:tc>
+          <w:tcPr>
+            <w:tcW w:w="5040" w:type="dxa"/>
+          </w:tcPr>
+          <w:p>
+            <w:r>
+              <w:t>PySpark</w:t>
+            </w:r>
+          </w:p>
+        </w:tc>
+        <w:tc>
+          <w:tcPr>
+            <w:tcW w:w="5040" w:type="dxa"/>
+          </w:tcPr>
+          <w:p>
+            <w:r>
+              <w:t>Python API for Apache Spark.</w:t>
+            </w:r>
+          </w:p>
+        </w:tc>
+      </w:tr>
+      <w:tr>
+        <w:tc>
+          <w:tcPr>
+            <w:tcW w:w="5040" w:type="dxa"/>
+          </w:tcPr>
+          <w:p>
+            <w:r>
+              <w:t>Driver</w:t>
+            </w:r>
+          </w:p>
+        </w:tc>
+        <w:tc>
+          <w:tcPr>
+            <w:tcW w:w="5040" w:type="dxa"/>
+          </w:tcPr>
+          <w:p>
+            <w:r>
+              <w:t>Main application process that coordinates execution.</w:t>
+            </w:r>
+          </w:p>
+        </w:tc>
+      </w:tr>
+      <w:tr>
+        <w:tc>
+          <w:tcPr>
+            <w:tcW w:w="5040" w:type="dxa"/>
+          </w:tcPr>
+          <w:p>
+            <w:r>
+              <w:lastRenderedPageBreak/>
+              <w:t>SparkSession</w:t>
+            </w:r>
+          </w:p>
+        </w:tc>
+        <w:tc>
+          <w:tcPr>
+            <w:tcW w:w="5040" w:type="dxa"/>
+          </w:tcPr>
+          <w:p>
+            <w:r>
+              <w:t>Modern main entry point for PySpark.</w:t>
+            </w:r>
+          </w:p>
+        </w:tc>
+      </w:tr>
+      <w:tr>
+        <w:tc>
+          <w:tcPr>
+            <w:tcW w:w="5040" w:type="dxa"/>
+          </w:tcPr>
+          <w:p>
+            <w:r>
+              <w:t>SparkContext</w:t>
+            </w:r>
+          </w:p>
+        </w:tc>
+        <w:tc>
+          <w:tcPr>
+            <w:tcW w:w="5040" w:type="dxa"/>
+          </w:tcPr>
+          <w:p>
+            <w:r>
+              <w:t>Core object that connects the Driver/application to Spark execution.</w:t>
+            </w:r>
+          </w:p>
+        </w:tc>
+      </w:tr>
+      <w:tr>
+        <w:tc>
+          <w:tcPr>
+            <w:tcW w:w="5040" w:type="dxa"/>
+          </w:tcPr>
+          <w:p>
+            <w:r>
+              <w:t>Cluster Manager</w:t>
+            </w:r>
+          </w:p>
+        </w:tc>
+        <w:tc>
+          <w:tcPr>
+            <w:tcW w:w="5040" w:type="dxa"/>
+          </w:tcPr>
+          <w:p>
+            <w:r>
+              <w:t>Allocates resources to applications.</w:t>
+            </w:r>
+          </w:p>
+        </w:tc>
+      </w:tr>
+      <w:tr>
+        <w:tc>
+          <w:tcPr>
+            <w:tcW w:w="5040" w:type="dxa"/>
+          </w:tcPr>
+          <w:p>
+            <w:r>
+              <w:t>Worker Node</w:t>
+            </w:r>
+          </w:p>
+        </w:tc>
+        <w:tc>
+          <w:tcPr>
+            <w:tcW w:w="5040" w:type="dxa"/>
+          </w:tcPr>
+          <w:p>
+            <w:r>
+              <w:t>Machine that provides resources and hosts executors.</w:t>
+            </w:r>
+          </w:p>
+        </w:tc>
+      </w:tr>
+      <w:tr>
+        <w:tc>
+          <w:tcPr>
+            <w:tcW w:w="5040" w:type="dxa"/>
+          </w:tcPr>
+          <w:p>
+            <w:r>
+              <w:t>Executor</w:t>
+            </w:r>
+          </w:p>
+        </w:tc>
+        <w:tc>
+          <w:tcPr>
+            <w:tcW w:w="5040" w:type="dxa"/>
+          </w:tcPr>
+          <w:p>
+            <w:r>
+              <w:t>Process that runs tasks for a Spark application.</w:t>
+            </w:r>
+          </w:p>
+        </w:tc>
+      </w:tr>
+      <w:tr>
+        <w:tc>
+          <w:tcPr>
+            <w:tcW w:w="5040" w:type="dxa"/>
+          </w:tcPr>
+          <w:p>
+            <w:r>
+              <w:t>Task</w:t>
+            </w:r>
+          </w:p>
+        </w:tc>
+        <w:tc>
+          <w:tcPr>
+            <w:tcW w:w="5040" w:type="dxa"/>
+          </w:tcPr>
+          <w:p>
+            <w:r>
+              <w:t>Unit of work that normally processes one partition.</w:t>
+            </w:r>
+          </w:p>
+        </w:tc>
+      </w:tr>
+      <w:tr>
+        <w:tc>
+          <w:tcPr>
+            <w:tcW w:w="5040" w:type="dxa"/>
+          </w:tcPr>
+          <w:p>
+            <w:r>
+              <w:t>Partition</w:t>
+            </w:r>
+          </w:p>
+        </w:tc>
+        <w:tc>
+          <w:tcPr>
+            <w:tcW w:w="5040" w:type="dxa"/>
+          </w:tcPr>
+          <w:p>
+            <w:r>
+              <w:t>Chunk of distributed data.</w:t>
+            </w:r>
+          </w:p>
+        </w:tc>
+      </w:tr>
+      <w:tr>
+        <w:tc>
+          <w:tcPr>
+            <w:tcW w:w="5040" w:type="dxa"/>
+          </w:tcPr>
+          <w:p>
+            <w:r>
+              <w:t>RDD</w:t>
+            </w:r>
+          </w:p>
+        </w:tc>
+        <w:tc>
+          <w:tcPr>
+            <w:tcW w:w="5040" w:type="dxa"/>
+          </w:tcPr>
+          <w:p>
+            <w:r>
+              <w:t>Immutable distributed collection with lineage.</w:t>
+            </w:r>
+          </w:p>
+        </w:tc>
+      </w:tr>
+      <w:tr>
+        <w:tc>
+          <w:tcPr>
+            <w:tcW w:w="5040" w:type="dxa"/>
+          </w:tcPr>
+          <w:p>
+            <w:r>
+              <w:t>DataFrame</w:t>
+            </w:r>
+          </w:p>
+        </w:tc>
+        <w:tc>
+          <w:tcPr>
+            <w:tcW w:w="5040" w:type="dxa"/>
+          </w:tcPr>
+          <w:p>
+            <w:r>
+              <w:t>Distributed table-like data structure with schema.</w:t>
+            </w:r>
+          </w:p>
+        </w:tc>
+      </w:tr>
+      <w:tr>
+        <w:tc>
+          <w:tcPr>
+            <w:tcW w:w="5040" w:type="dxa"/>
+          </w:tcPr>
+          <w:p>
+            <w:r>
+              <w:t>Transformation</w:t>
+            </w:r>
+          </w:p>
+        </w:tc>
+        <w:tc>
+          <w:tcPr>
+            <w:tcW w:w="5040" w:type="dxa"/>
+          </w:tcPr>
+          <w:p>
+            <w:r>
+              <w:t>Lazy operation that creates a new dataset/plan.</w:t>
+            </w:r>
+          </w:p>
+        </w:tc>
+      </w:tr>
+      <w:tr>
+        <w:tc>
+          <w:tcPr>
+            <w:tcW w:w="5040" w:type="dxa"/>
+          </w:tcPr>
+          <w:p>
+            <w:r>
+              <w:t>Action</w:t>
+            </w:r>
+          </w:p>
+        </w:tc>
+        <w:tc>
+          <w:tcPr>
+            <w:tcW w:w="5040" w:type="dxa"/>
+          </w:tcPr>
+          <w:p>
+            <w:r>
+              <w:t>Operation that requests a result/output and triggers execution.</w:t>
+            </w:r>
+          </w:p>
+        </w:tc>
+      </w:tr>
+      <w:tr>
+        <w:tc>
+          <w:tcPr>
+            <w:tcW w:w="5040" w:type="dxa"/>
+          </w:tcPr>
+          <w:p>
+            <w:r>
+              <w:t>DAG</w:t>
+            </w:r>
+          </w:p>
+        </w:tc>
+        <w:tc>
+          <w:tcPr>
+            <w:tcW w:w="5040" w:type="dxa"/>
+          </w:tcPr>
+          <w:p>
+            <w:r>
+              <w:t>Directed acyclic representation of computation dependencies.</w:t>
+            </w:r>
+          </w:p>
+        </w:tc>
+      </w:tr>
+      <w:tr>
+        <w:tc>
+          <w:tcPr>
+            <w:tcW w:w="5040" w:type="dxa"/>
+          </w:tcPr>
+          <w:p>
+            <w:r>
+              <w:t>Stage</w:t>
+            </w:r>
+          </w:p>
+        </w:tc>
+        <w:tc>
+          <w:tcPr>
+            <w:tcW w:w="5040" w:type="dxa"/>
+          </w:tcPr>
+          <w:p>
+            <w:r>
+              <w:t>Set of tasks separated by shuffle boundaries.</w:t>
+            </w:r>
+          </w:p>
+        </w:tc>
+      </w:tr>
+      <w:tr>
+        <w:tc>
+          <w:tcPr>
+            <w:tcW w:w="5040" w:type="dxa"/>
+          </w:tcPr>
+          <w:p>
+            <w:r>
+              <w:t>Shuffle</w:t>
+            </w:r>
+          </w:p>
+        </w:tc>
+        <w:tc>
+          <w:tcPr>
+            <w:tcW w:w="5040" w:type="dxa"/>
+          </w:tcPr>
+          <w:p>
+            <w:r>
+              <w:t>Redistribution of data across partitions.</w:t>
+            </w:r>
+          </w:p>
+        </w:tc>
+      </w:tr>
+      <w:tr>
+        <w:tc>
+          <w:tcPr>
+            <w:tcW w:w="5040" w:type="dxa"/>
+          </w:tcPr>
+          <w:p>
+            <w:r>
+              <w:t>Cache/Persist</w:t>
+            </w:r>
+          </w:p>
+        </w:tc>
+        <w:tc>
+          <w:tcPr>
+            <w:tcW w:w="5040" w:type="dxa"/>
+          </w:tcPr>
+          <w:p>
+            <w:r>
+              <w:t>Keep computed data for reuse.</w:t>
+            </w:r>
+          </w:p>
+        </w:tc>
+      </w:tr>
+      <w:tr>
+        <w:tc>
+          <w:tcPr>
+            <w:tcW w:w="5040" w:type="dxa"/>
+          </w:tcPr>
+          <w:p>
+            <w:r>
+              <w:t>Lineage</w:t>
+            </w:r>
+          </w:p>
+        </w:tc>
+        <w:tc>
+          <w:tcPr>
+            <w:tcW w:w="5040" w:type="dxa"/>
+          </w:tcPr>
+          <w:p>
+            <w:r>
+              <w:t>Dependency history used for recomputation.</w:t>
+            </w:r>
+          </w:p>
+        </w:tc>
+      </w:tr>
+      <w:tr>
+        <w:tc>
+          <w:tcPr>
+            <w:tcW w:w="5040" w:type="dxa"/>
+          </w:tcPr>
+          <w:p>
+            <w:r>
+              <w:t>Catalyst</w:t>
+            </w:r>
+          </w:p>
+        </w:tc>
+        <w:tc>
+          <w:tcPr>
+            <w:tcW w:w="5040" w:type="dxa"/>
+          </w:tcPr>
+          <w:p>
+            <w:r>
+              <w:t>Spark SQL query optimization framework.</w:t>
+            </w:r>
+          </w:p>
+        </w:tc>
+      </w:tr>
+      <w:tr>
+        <w:tc>
+          <w:tcPr>
+            <w:tcW w:w="5040" w:type="dxa"/>
+          </w:tcPr>
+          <w:p>
+            <w:r>
+              <w:t>AQE</w:t>
+            </w:r>
+          </w:p>
+        </w:tc>
+        <w:tc>
+          <w:tcPr>
+            <w:tcW w:w="5040" w:type="dxa"/>
+          </w:tcPr>
+          <w:p>
+            <w:r>
+              <w:t>Runtime-adaptive query optimization.</w:t>
+            </w:r>
+          </w:p>
+        </w:tc>
+      </w:tr>
+    </w:tbl>
+    <w:p>
+      <w:pPr>
+        <w:pStyle w:val="Heading1"/>
+      </w:pPr>
+      <w:r>
+        <w:t>40. Final Mental Model</w:t>
+      </w:r>
+    </w:p>
+    <w:p>
+      <w:r>
+        <w:t>If you remember only one architecture, remember this:</w:t>
+      </w:r>
+    </w:p>
+    <w:p>
+      <w:pPr>
+        <w:ind w:left="360" w:right="360"/>
+      </w:pPr>
+      <w:r>
+        <w:rPr>
+          <w:rFonts w:ascii="Consolas" w:hAnsi="Consolas"/>
+          <w:sz w:val="18"/>
+        </w:rPr>
+        <w:t>PYSPARK APPLICATION</w:t>
+      </w:r>
+      <w:r>
+        <w:rPr>
+          <w:rFonts w:ascii="Consolas" w:hAnsi="Consolas"/>
+          <w:sz w:val="18"/>
+        </w:rPr>
+        <w:br/>
+        <w:t xml:space="preserve">        |</w:t>
+      </w:r>
+      <w:r>
+        <w:rPr>
+          <w:rFonts w:ascii="Consolas" w:hAnsi="Consolas"/>
+          <w:sz w:val="18"/>
+        </w:rPr>
+        <w:br/>
+      </w:r>
+      <w:r>
+        <w:rPr>
+          <w:rFonts w:ascii="Consolas" w:hAnsi="Consolas"/>
+          <w:sz w:val="18"/>
+        </w:rPr>
+        <w:lastRenderedPageBreak/>
+        <w:t xml:space="preserve">        v</w:t>
+      </w:r>
+      <w:r>
+        <w:rPr>
+          <w:rFonts w:ascii="Consolas" w:hAnsi="Consolas"/>
+          <w:sz w:val="18"/>
+        </w:rPr>
+        <w:br/>
+        <w:t xml:space="preserve">      DRIVER</w:t>
+      </w:r>
+      <w:r>
+        <w:rPr>
+          <w:rFonts w:ascii="Consolas" w:hAnsi="Consolas"/>
+          <w:sz w:val="18"/>
+        </w:rPr>
+        <w:br/>
+        <w:t xml:space="preserve">        |</w:t>
+      </w:r>
+      <w:r>
+        <w:rPr>
+          <w:rFonts w:ascii="Consolas" w:hAnsi="Consolas"/>
+          <w:sz w:val="18"/>
+        </w:rPr>
+        <w:br/>
+        <w:t xml:space="preserve">   SparkSession</w:t>
+      </w:r>
+      <w:r>
+        <w:rPr>
+          <w:rFonts w:ascii="Consolas" w:hAnsi="Consolas"/>
+          <w:sz w:val="18"/>
+        </w:rPr>
+        <w:br/>
+        <w:t xml:space="preserve">        |</w:t>
+      </w:r>
+      <w:r>
+        <w:rPr>
+          <w:rFonts w:ascii="Consolas" w:hAnsi="Consolas"/>
+          <w:sz w:val="18"/>
+        </w:rPr>
+        <w:br/>
+        <w:t xml:space="preserve">   SparkContext</w:t>
+      </w:r>
+      <w:r>
+        <w:rPr>
+          <w:rFonts w:ascii="Consolas" w:hAnsi="Consolas"/>
+          <w:sz w:val="18"/>
+        </w:rPr>
+        <w:br/>
+        <w:t xml:space="preserve">        |</w:t>
+      </w:r>
+      <w:r>
+        <w:rPr>
+          <w:rFonts w:ascii="Consolas" w:hAnsi="Consolas"/>
+          <w:sz w:val="18"/>
+        </w:rPr>
+        <w:br/>
+        <w:t xml:space="preserve">        v</w:t>
+      </w:r>
+      <w:r>
+        <w:rPr>
+          <w:rFonts w:ascii="Consolas" w:hAnsi="Consolas"/>
+          <w:sz w:val="18"/>
+        </w:rPr>
+        <w:br/>
+        <w:t xml:space="preserve">  CLUSTER MANAGER</w:t>
+      </w:r>
+      <w:r>
+        <w:rPr>
+          <w:rFonts w:ascii="Consolas" w:hAnsi="Consolas"/>
+          <w:sz w:val="18"/>
+        </w:rPr>
+        <w:br/>
+        <w:t xml:space="preserve">        |</w:t>
+      </w:r>
+      <w:r>
+        <w:rPr>
+          <w:rFonts w:ascii="Consolas" w:hAnsi="Consolas"/>
+          <w:sz w:val="18"/>
+        </w:rPr>
+        <w:br/>
+        <w:t xml:space="preserve">        v</w:t>
+      </w:r>
+      <w:r>
+        <w:rPr>
+          <w:rFonts w:ascii="Consolas" w:hAnsi="Consolas"/>
+          <w:sz w:val="18"/>
+        </w:rPr>
+        <w:br/>
+        <w:t xml:space="preserve">  WORKER NODES</w:t>
+      </w:r>
+      <w:r>
+        <w:rPr>
+          <w:rFonts w:ascii="Consolas" w:hAnsi="Consolas"/>
+          <w:sz w:val="18"/>
+        </w:rPr>
+        <w:br/>
+        <w:t xml:space="preserve">   |       |       |</w:t>
+      </w:r>
+      <w:r>
+        <w:rPr>
+          <w:rFonts w:ascii="Consolas" w:hAnsi="Consolas"/>
+          <w:sz w:val="18"/>
+        </w:rPr>
+        <w:br/>
+        <w:t>Executor Executor Executor</w:t>
+      </w:r>
+      <w:r>
+        <w:rPr>
+          <w:rFonts w:ascii="Consolas" w:hAnsi="Consolas"/>
+          <w:sz w:val="18"/>
+        </w:rPr>
+        <w:br/>
+        <w:t xml:space="preserve">   |       |       |</w:t>
+      </w:r>
+      <w:r>
+        <w:rPr>
+          <w:rFonts w:ascii="Consolas" w:hAnsi="Consolas"/>
+          <w:sz w:val="18"/>
+        </w:rPr>
+        <w:br/>
+        <w:t xml:space="preserve"> Tasks    Tasks    Tasks</w:t>
+      </w:r>
+      <w:r>
+        <w:rPr>
+          <w:rFonts w:ascii="Consolas" w:hAnsi="Consolas"/>
+          <w:sz w:val="18"/>
+        </w:rPr>
+        <w:br/>
+        <w:t xml:space="preserve">   |       |       |</w:t>
+      </w:r>
+      <w:r>
+        <w:rPr>
+          <w:rFonts w:ascii="Consolas" w:hAnsi="Consolas"/>
+          <w:sz w:val="18"/>
+        </w:rPr>
+        <w:br/>
+        <w:t>Partitions of distributed data</w:t>
+      </w:r>
+      <w:r>
+        <w:rPr>
+          <w:rFonts w:ascii="Consolas" w:hAnsi="Consolas"/>
+          <w:sz w:val="18"/>
+        </w:rPr>
+        <w:br/>
+      </w:r>
+      <w:r>
+        <w:rPr>
+          <w:rFonts w:ascii="Consolas" w:hAnsi="Consolas"/>
+          <w:sz w:val="18"/>
+        </w:rPr>
+        <w:br/>
+        <w:t>ACTION</w:t>
+      </w:r>
+      <w:r>
+        <w:rPr>
+          <w:rFonts w:ascii="Consolas" w:hAnsi="Consolas"/>
+          <w:sz w:val="18"/>
+        </w:rPr>
+        <w:br/>
+        <w:t xml:space="preserve">  -&gt; JOB</w:t>
+      </w:r>
+      <w:r>
+        <w:rPr>
+          <w:rFonts w:ascii="Consolas" w:hAnsi="Consolas"/>
+          <w:sz w:val="18"/>
+        </w:rPr>
+        <w:br/>
+        <w:t xml:space="preserve">      -&gt; STAGES</w:t>
+      </w:r>
+      <w:r>
+        <w:rPr>
+          <w:rFonts w:ascii="Consolas" w:hAnsi="Consolas"/>
+          <w:sz w:val="18"/>
+        </w:rPr>
+        <w:br/>
+        <w:t xml:space="preserve">          -&gt; TASKS</w:t>
+      </w:r>
+      <w:r>
+        <w:rPr>
+          <w:rFonts w:ascii="Consolas" w:hAnsi="Consolas"/>
+          <w:sz w:val="18"/>
+        </w:rPr>
+        <w:br/>
+        <w:t xml:space="preserve">              -&gt; EXECUTORS</w:t>
+      </w:r>
+      <w:r>
+        <w:rPr>
+          <w:rFonts w:ascii="Consolas" w:hAnsi="Consolas"/>
+          <w:sz w:val="18"/>
+        </w:rPr>
+        <w:br/>
+        <w:t xml:space="preserve">                  -&gt; process PARTITIONS</w:t>
+      </w:r>
+      <w:r>
+        <w:rPr>
+          <w:rFonts w:ascii="Consolas" w:hAnsi="Consolas"/>
+          <w:sz w:val="18"/>
+        </w:rPr>
+        <w:br/>
+      </w:r>
+      <w:r>
+        <w:rPr>
+          <w:rFonts w:ascii="Consolas" w:hAnsi="Consolas"/>
+          <w:sz w:val="18"/>
+        </w:rPr>
+        <w:br/>
+        <w:t>Shuffle = data moves between partitions/executors.</w:t>
+      </w:r>
+      <w:r>
+        <w:rPr>
+          <w:rFonts w:ascii="Consolas" w:hAnsi="Consolas"/>
+          <w:sz w:val="18"/>
+        </w:rPr>
+        <w:br/>
+        <w:t>Cache    = keep reusable computed data.</w:t>
+      </w:r>
+      <w:r>
+        <w:rPr>
+          <w:rFonts w:ascii="Consolas" w:hAnsi="Consolas"/>
+          <w:sz w:val="18"/>
+        </w:rPr>
+        <w:br/>
+        <w:t>Lineage  = remember how data can be recomputed.</w:t>
+      </w:r>
+      <w:r>
+        <w:rPr>
+          <w:rFonts w:ascii="Consolas" w:hAnsi="Consolas"/>
+          <w:sz w:val="18"/>
+        </w:rPr>
+        <w:br/>
+        <w:t>DAG      = dependency graph used to plan execution.</w:t>
+      </w:r>
+    </w:p>
+    <w:p>
+      <w:r>
+        <w:t>The most important distinction to keep clear: the Driver coordinates; the cluster manager allocates resources; worker nodes provide machines/resources; executors run the application work; tasks process partitions; SparkSession is the modern PySpark entry point; SparkContext is the core context inside the Driver.</w:t>
+      </w:r>
+    </w:p>
+    <w:p>
+      <w:pPr>
+        <w:pStyle w:val="Heading1"/>
+      </w:pPr>
+      <w:r>
+        <w:t>41. Recommended Learning Order</w:t>
+      </w:r>
+    </w:p>
+    <w:p>
+      <w:pPr>
+        <w:pStyle w:val="ListNumber"/>
         <w:tabs>
           <w:tab w:val="num" w:pos="360"/>
         </w:tabs>
         <w:ind w:left="360" w:hanging="360"/>
       </w:pPr>
       <w:r>
-        <w:t>Lineage is a dependency history for derived data.</w:t>
-      </w:r>
-    </w:p>
-    <w:p>
-      <w:pPr>
-        <w:pStyle w:val="ListBullet"/>
+        <w:t>Python fundamentals and functions</w:t>
+      </w:r>
+    </w:p>
+    <w:p>
+      <w:pPr>
+        <w:pStyle w:val="ListNumber"/>
         <w:tabs>
           <w:tab w:val="num" w:pos="360"/>
         </w:tabs>
         <w:ind w:left="360" w:hanging="360"/>
       </w:pPr>
       <w:r>
-        <w:t>Partition loss can often be recovered through recomputation.</w:t>
-      </w:r>
-    </w:p>
-    <w:p>
-      <w:pPr>
-        <w:pStyle w:val="ListBullet"/>
+        <w:t>SparkSession and basic DataFrame operations</w:t>
+      </w:r>
+    </w:p>
+    <w:p>
+      <w:pPr>
+        <w:pStyle w:val="ListNumber"/>
         <w:tabs>
           <w:tab w:val="num" w:pos="360"/>
         </w:tabs>
         <w:ind w:left="360" w:hanging="360"/>
       </w:pPr>
       <w:r>
-        <w:t>Persisting data can reduce the amount of recomputation required.</w:t>
+        <w:t>Schemas and data types</w:t>
+      </w:r>
+    </w:p>
+    <w:p>
+      <w:pPr>
+        <w:pStyle w:val="ListNumber"/>
+        <w:tabs>
+          <w:tab w:val="num" w:pos="360"/>
+        </w:tabs>
+        <w:ind w:left="360" w:hanging="360"/>
+      </w:pPr>
+      <w:r>
+        <w:t>Reading/writing CSV, Parquet, and JSON</w:t>
+      </w:r>
+    </w:p>
+    <w:p>
+      <w:pPr>
+        <w:pStyle w:val="ListNumber"/>
+        <w:tabs>
+          <w:tab w:val="num" w:pos="360"/>
+        </w:tabs>
+        <w:ind w:left="360" w:hanging="360"/>
+      </w:pPr>
+      <w:r>
+        <w:t>Transformations vs actions and lazy evaluation</w:t>
+      </w:r>
+    </w:p>
+    <w:p>
+      <w:pPr>
+        <w:pStyle w:val="ListNumber"/>
+        <w:tabs>
+          <w:tab w:val="num" w:pos="360"/>
+        </w:tabs>
+        <w:ind w:left="360" w:hanging="360"/>
+      </w:pPr>
+      <w:r>
+        <w:t>Partitions and parallelism</w:t>
+      </w:r>
+    </w:p>
+    <w:p>
+      <w:pPr>
+        <w:pStyle w:val="ListNumber"/>
+        <w:tabs>
+          <w:tab w:val="num" w:pos="360"/>
+        </w:tabs>
+        <w:ind w:left="360" w:hanging="360"/>
+      </w:pPr>
+      <w:r>
+        <w:t>Driver, executor, worker, and cluster manager architecture</w:t>
+      </w:r>
+    </w:p>
+    <w:p>
+      <w:pPr>
+        <w:pStyle w:val="ListNumber"/>
+        <w:tabs>
+          <w:tab w:val="num" w:pos="360"/>
+        </w:tabs>
+        <w:ind w:left="360" w:hanging="360"/>
+      </w:pPr>
+      <w:r>
+        <w:t>Jobs, stages, tasks, DAGs, and shuffles</w:t>
+      </w:r>
+    </w:p>
+    <w:p>
+      <w:pPr>
+        <w:pStyle w:val="ListNumber"/>
+        <w:tabs>
+          <w:tab w:val="num" w:pos="360"/>
+        </w:tabs>
+        <w:ind w:left="360" w:hanging="360"/>
+      </w:pPr>
+      <w:r>
+        <w:t>Joins, aggregations, window functions, and SQL</w:t>
+      </w:r>
+    </w:p>
+    <w:p>
+      <w:pPr>
+        <w:pStyle w:val="ListNumber"/>
+        <w:tabs>
+          <w:tab w:val="num" w:pos="360"/>
+        </w:tabs>
+        <w:ind w:left="360" w:hanging="360"/>
+      </w:pPr>
+      <w:r>
+        <w:t>Caching/persistence and broadcast joins</w:t>
+      </w:r>
+    </w:p>
+    <w:p>
+      <w:pPr>
+        <w:pStyle w:val="ListNumber"/>
+        <w:tabs>
+          <w:tab w:val="num" w:pos="360"/>
+        </w:tabs>
+        <w:ind w:left="360" w:hanging="360"/>
+      </w:pPr>
+      <w:r>
+        <w:t>Data skew and performance tuning</w:t>
+      </w:r>
+    </w:p>
+    <w:p>
+      <w:pPr>
+        <w:pStyle w:val="ListNumber"/>
+        <w:tabs>
+          <w:tab w:val="num" w:pos="360"/>
+        </w:tabs>
+        <w:ind w:left="360" w:hanging="360"/>
+      </w:pPr>
+      <w:r>
+        <w:lastRenderedPageBreak/>
+        <w:t>Spark UI and execution plans</w:t>
+      </w:r>
+    </w:p>
+    <w:p>
+      <w:pPr>
+        <w:pStyle w:val="ListNumber"/>
+        <w:tabs>
+          <w:tab w:val="num" w:pos="360"/>
+        </w:tabs>
+        <w:ind w:left="360" w:hanging="360"/>
+      </w:pPr>
+      <w:r>
+        <w:t>UDFs and Python/JVM considerations</w:t>
+      </w:r>
+    </w:p>
+    <w:p>
+      <w:pPr>
+        <w:pStyle w:val="ListNumber"/>
+        <w:tabs>
+          <w:tab w:val="num" w:pos="360"/>
+        </w:tabs>
+        <w:ind w:left="360" w:hanging="360"/>
+      </w:pPr>
+      <w:r>
+        <w:t>spark-submit and cluster deployment</w:t>
+      </w:r>
+    </w:p>
+    <w:p>
+      <w:pPr>
+        <w:pStyle w:val="ListNumber"/>
+        <w:tabs>
+          <w:tab w:val="num" w:pos="360"/>
+        </w:tabs>
+        <w:ind w:left="360" w:hanging="360"/>
+      </w:pPr>
+      <w:r>
+        <w:t>Structured Streaming and advanced Spark topics</w:t>
       </w:r>
     </w:p>
     <w:p/>
@@ -2275,6 +4621,24 @@
 <file path=word/numbering.xml><?xml version="1.0" encoding="utf-8"?>
 <w:numbering xmlns:wpc="http://schemas.microsoft.com/office/word/2010/wordprocessingCanvas" xmlns:cx="http://schemas.microsoft.com/office/drawing/2014/chartex" xmlns:cx1="http://schemas.microsoft.com/office/drawing/2015/9/8/chartex" xmlns:cx2="http://schemas.microsoft.com/office/drawing/2015/10/21/chartex" xmlns:cx3="http://schemas.microsoft.com/office/drawing/2016/5/9/chartex" xmlns:cx4="http://schemas.microsoft.com/office/drawing/2016/5/10/chartex" xmlns:cx5="http://schemas.microsoft.com/office/drawing/2016/5/11/chartex" xmlns:cx6="http://schemas.microsoft.com/office/drawing/2016/5/12/chartex" xmlns:cx7="http://schemas.microsoft.com/office/drawing/2016/5/13/chartex" xmlns:cx8="http://schemas.microsoft.com/office/drawing/2016/5/14/chartex" xmlns:mc="http://schemas.openxmlformats.org/markup-compatibility/2006" xmlns:aink="http://schemas.microsoft.com/office/drawing/2016/ink" xmlns:am3d="http://schemas.microsoft.com/office/drawing/2017/model3d" xmlns:o="urn:schemas-microsoft-com:office:office" xmlns:oel="http://schemas.microsoft.com/office/2019/extlst" xmlns:r="http://schemas.openxmlformats.org/officeDocument/2006/relationships" xmlns:m="http://schemas.openxmlformats.org/officeDocument/2006/math" xmlns:v="urn:schemas-microsoft-com:vml" xmlns:wp14="http://schemas.microsoft.com/office/word/2010/wordprocessingDrawing" xmlns:wp="http://schemas.openxmlformats.org/drawingml/2006/wordprocessingDrawing" xmlns:w10="urn:schemas-microsoft-com:office:word" xmlns:w="http://schemas.openxmlformats.org/wordprocessingml/2006/main" xmlns:w14="http://schemas.microsoft.com/office/word/2010/wordml" xmlns:w15="http://schemas.microsoft.com/office/word/2012/wordml" xmlns:w16cex="http://schemas.microsoft.com/office/word/2018/wordml/cex" xmlns:w16cid="http://schemas.microsoft.com/office/word/2016/wordml/cid" xmlns:w16="http://schemas.microsoft.com/office/word/2018/wordml" xmlns:w16du="http://schemas.microsoft.com/office/word/2023/wordml/word16du" xmlns:w16sdtdh="http://schemas.microsoft.com/office/word/2020/wordml/sdtdatahash" xmlns:w16sdtfl="http://schemas.microsoft.com/office/word/2024/wordml/sdtformatlock" xmlns:w16se="http://schemas.microsoft.com/office/word/2015/wordml/symex" xmlns:wpg="http://schemas.microsoft.com/office/word/2010/wordprocessingGroup" xmlns:wpi="http://schemas.microsoft.com/office/word/2010/wordprocessingInk" xmlns:wne="http://schemas.microsoft.com/office/word/2006/wordml" xmlns:wps="http://schemas.microsoft.com/office/word/2010/wordprocessingShape" mc:Ignorable="w14 w15 w16se w16cid w16 w16cex w16sdtdh w16sdtfl w16du wp14">
   <w:abstractNum w:abstractNumId="0" w15:restartNumberingAfterBreak="0">
+    <w:nsid w:val="FFFFFF88"/>
+    <w:multiLevelType w:val="singleLevel"/>
+    <w:tmpl w:val="57886EDA"/>
+    <w:lvl w:ilvl="0">
+      <w:start w:val="1"/>
+      <w:numFmt w:val="decimal"/>
+      <w:pStyle w:val="ListNumber"/>
+      <w:lvlText w:val="%1."/>
+      <w:lvlJc w:val="left"/>
+      <w:pPr>
+        <w:tabs>
+          <w:tab w:val="num" w:pos="360"/>
+        </w:tabs>
+        <w:ind w:left="360" w:hanging="360"/>
+      </w:pPr>
+    </w:lvl>
+  </w:abstractNum>
+  <w:abstractNum w:abstractNumId="1" w15:restartNumberingAfterBreak="0">
     <w:nsid w:val="FFFFFF89"/>
     <w:multiLevelType w:val="singleLevel"/>
     <w:tmpl w:val="F65A7156"/>
@@ -2296,6 +4660,9 @@
     </w:lvl>
   </w:abstractNum>
   <w:num w:numId="1" w16cid:durableId="515580269">
+    <w:abstractNumId w:val="1"/>
+  </w:num>
+  <w:num w:numId="2" w16cid:durableId="1459104903">
     <w:abstractNumId w:val="0"/>
   </w:num>
 </w:numbering>
@@ -3242,7 +5609,6 @@
       <w:tabs>
         <w:tab w:val="clear" w:pos="360"/>
       </w:tabs>
-      <w:ind w:left="0" w:firstLine="0"/>
       <w:contextualSpacing/>
     </w:pPr>
   </w:style>
@@ -3271,6 +5637,23 @@
         <w:insideV w:val="single" w:sz="4" w:space="0" w:color="auto"/>
       </w:tblBorders>
     </w:tblPr>
+  </w:style>
+  <w:style w:type="paragraph" w:styleId="ListNumber">
+    <w:name w:val="List Number"/>
+    <w:basedOn w:val="Normal"/>
+    <w:uiPriority w:val="99"/>
+    <w:unhideWhenUsed/>
+    <w:rsid w:val="00786D94"/>
+    <w:pPr>
+      <w:numPr>
+        <w:numId w:val="2"/>
+      </w:numPr>
+      <w:tabs>
+        <w:tab w:val="clear" w:pos="360"/>
+      </w:tabs>
+      <w:ind w:left="0" w:firstLine="0"/>
+      <w:contextualSpacing/>
+    </w:pPr>
   </w:style>
 </w:styles>
 </file>

</xml_diff>